<commit_message>
fix: add new class, add new attribute
</commit_message>
<xml_diff>
--- a/docs/semester-6/task5.docx
+++ b/docs/semester-6/task5.docx
@@ -164,6 +164,7 @@
         <w:spacing w:after="120"/>
         <w:jc w:val="center"/>
       </w:pPr>
+      <w:proofErr w:type="spellStart"/>
       <w:r>
         <w:rPr>
           <w:b/>
@@ -171,7 +172,57 @@
           <w:sz w:val="28"/>
           <w:szCs w:val="28"/>
         </w:rPr>
-        <w:t xml:space="preserve">Отчет по заданию </w:t>
+        <w:t>Отчет</w:t>
+      </w:r>
+      <w:proofErr w:type="spellEnd"/>
+      <w:r>
+        <w:rPr>
+          <w:b/>
+          <w:bCs/>
+          <w:sz w:val="28"/>
+          <w:szCs w:val="28"/>
+        </w:rPr>
+        <w:t xml:space="preserve"> </w:t>
+      </w:r>
+      <w:proofErr w:type="spellStart"/>
+      <w:r>
+        <w:rPr>
+          <w:b/>
+          <w:bCs/>
+          <w:sz w:val="28"/>
+          <w:szCs w:val="28"/>
+        </w:rPr>
+        <w:t>по</w:t>
+      </w:r>
+      <w:proofErr w:type="spellEnd"/>
+      <w:r>
+        <w:rPr>
+          <w:b/>
+          <w:bCs/>
+          <w:sz w:val="28"/>
+          <w:szCs w:val="28"/>
+        </w:rPr>
+        <w:t xml:space="preserve"> </w:t>
+      </w:r>
+      <w:proofErr w:type="spellStart"/>
+      <w:r>
+        <w:rPr>
+          <w:b/>
+          <w:bCs/>
+          <w:sz w:val="28"/>
+          <w:szCs w:val="28"/>
+        </w:rPr>
+        <w:t>заданию</w:t>
+      </w:r>
+      <w:proofErr w:type="spellEnd"/>
+      <w:r>
+        <w:rPr>
+          <w:b/>
+          <w:bCs/>
+          <w:sz w:val="28"/>
+          <w:szCs w:val="28"/>
+        </w:rPr>
+        <w:t xml:space="preserve"> </w:t>
       </w:r>
       <w:r>
         <w:rPr>
@@ -539,8 +590,69 @@
         </w:rPr>
         <w:t xml:space="preserve">Диаграмма классов отражает основные сущности предметной области: пользователей системы и их роли, полевые устройства, зоны наблюдения, измерения датчиков, тревоги, уведомления, аналитические отчёты, акты инспекторов и вспомогательные сущности. </w:t>
       </w:r>
-      <w:r>
-        <w:t>Ниже приведено описание классов, использованных при построении диаграммы.</w:t>
+      <w:proofErr w:type="spellStart"/>
+      <w:r>
+        <w:t>Ниже</w:t>
+      </w:r>
+      <w:proofErr w:type="spellEnd"/>
+      <w:r>
+        <w:t xml:space="preserve"> </w:t>
+      </w:r>
+      <w:proofErr w:type="spellStart"/>
+      <w:r>
+        <w:t>приведено</w:t>
+      </w:r>
+      <w:proofErr w:type="spellEnd"/>
+      <w:r>
+        <w:t xml:space="preserve"> </w:t>
+      </w:r>
+      <w:proofErr w:type="spellStart"/>
+      <w:r>
+        <w:t>описание</w:t>
+      </w:r>
+      <w:proofErr w:type="spellEnd"/>
+      <w:r>
+        <w:t xml:space="preserve"> </w:t>
+      </w:r>
+      <w:proofErr w:type="spellStart"/>
+      <w:r>
+        <w:t>классов</w:t>
+      </w:r>
+      <w:proofErr w:type="spellEnd"/>
+      <w:r>
+        <w:t xml:space="preserve">, </w:t>
+      </w:r>
+      <w:proofErr w:type="spellStart"/>
+      <w:r>
+        <w:t>использованных</w:t>
+      </w:r>
+      <w:proofErr w:type="spellEnd"/>
+      <w:r>
+        <w:t xml:space="preserve"> </w:t>
+      </w:r>
+      <w:proofErr w:type="spellStart"/>
+      <w:r>
+        <w:t>при</w:t>
+      </w:r>
+      <w:proofErr w:type="spellEnd"/>
+      <w:r>
+        <w:t xml:space="preserve"> </w:t>
+      </w:r>
+      <w:proofErr w:type="spellStart"/>
+      <w:r>
+        <w:t>построении</w:t>
+      </w:r>
+      <w:proofErr w:type="spellEnd"/>
+      <w:r>
+        <w:t xml:space="preserve"> </w:t>
+      </w:r>
+      <w:proofErr w:type="spellStart"/>
+      <w:r>
+        <w:t>диаграммы</w:t>
+      </w:r>
+      <w:proofErr w:type="spellEnd"/>
+      <w:r>
+        <w:t>.</w:t>
       </w:r>
     </w:p>
     <w:p/>
@@ -562,6 +674,7 @@
             <w:tcW w:w="2000" w:type="dxa"/>
           </w:tcPr>
           <w:p>
+            <w:proofErr w:type="spellStart"/>
             <w:r>
               <w:rPr>
                 <w:b/>
@@ -571,6 +684,7 @@
               </w:rPr>
               <w:t>Класс</w:t>
             </w:r>
+            <w:proofErr w:type="spellEnd"/>
           </w:p>
         </w:tc>
         <w:tc>
@@ -578,6 +692,7 @@
             <w:tcW w:w="3000" w:type="dxa"/>
           </w:tcPr>
           <w:p>
+            <w:proofErr w:type="spellStart"/>
             <w:r>
               <w:rPr>
                 <w:b/>
@@ -587,6 +702,7 @@
               </w:rPr>
               <w:t>Атрибуты</w:t>
             </w:r>
+            <w:proofErr w:type="spellEnd"/>
           </w:p>
         </w:tc>
         <w:tc>
@@ -594,6 +710,7 @@
             <w:tcW w:w="2060" w:type="dxa"/>
           </w:tcPr>
           <w:p>
+            <w:proofErr w:type="spellStart"/>
             <w:r>
               <w:rPr>
                 <w:b/>
@@ -603,6 +720,7 @@
               </w:rPr>
               <w:t>Методы</w:t>
             </w:r>
+            <w:proofErr w:type="spellEnd"/>
           </w:p>
         </w:tc>
         <w:tc>
@@ -610,6 +728,7 @@
             <w:tcW w:w="2300" w:type="dxa"/>
           </w:tcPr>
           <w:p>
+            <w:proofErr w:type="spellStart"/>
             <w:r>
               <w:rPr>
                 <w:b/>
@@ -619,6 +738,7 @@
               </w:rPr>
               <w:t>Связи</w:t>
             </w:r>
+            <w:proofErr w:type="spellEnd"/>
           </w:p>
         </w:tc>
       </w:tr>
@@ -647,8 +767,49 @@
                 <w:sz w:val="20"/>
                 <w:szCs w:val="20"/>
               </w:rPr>
-              <w:t>id, login, passwordHash, role: UserRole, email, fullName</w:t>
-            </w:r>
+              <w:t xml:space="preserve">id, login, </w:t>
+            </w:r>
+            <w:proofErr w:type="spellStart"/>
+            <w:r>
+              <w:rPr>
+                <w:sz w:val="20"/>
+                <w:szCs w:val="20"/>
+              </w:rPr>
+              <w:t>passwordHash</w:t>
+            </w:r>
+            <w:proofErr w:type="spellEnd"/>
+            <w:r>
+              <w:rPr>
+                <w:sz w:val="20"/>
+                <w:szCs w:val="20"/>
+              </w:rPr>
+              <w:t xml:space="preserve">, role: </w:t>
+            </w:r>
+            <w:proofErr w:type="spellStart"/>
+            <w:r>
+              <w:rPr>
+                <w:sz w:val="20"/>
+                <w:szCs w:val="20"/>
+              </w:rPr>
+              <w:t>UserRole</w:t>
+            </w:r>
+            <w:proofErr w:type="spellEnd"/>
+            <w:r>
+              <w:rPr>
+                <w:sz w:val="20"/>
+                <w:szCs w:val="20"/>
+              </w:rPr>
+              <w:t xml:space="preserve">, email, </w:t>
+            </w:r>
+            <w:proofErr w:type="spellStart"/>
+            <w:r>
+              <w:rPr>
+                <w:sz w:val="20"/>
+                <w:szCs w:val="20"/>
+              </w:rPr>
+              <w:t>fullName</w:t>
+            </w:r>
+            <w:proofErr w:type="spellEnd"/>
           </w:p>
         </w:tc>
         <w:tc>
@@ -656,12 +817,62 @@
             <w:tcW w:w="2060" w:type="dxa"/>
           </w:tcPr>
           <w:p>
-            <w:r>
-              <w:rPr>
-                <w:sz w:val="20"/>
-                <w:szCs w:val="20"/>
-              </w:rPr>
-              <w:t>register(), login(), updateProfile()</w:t>
+            <w:proofErr w:type="gramStart"/>
+            <w:r>
+              <w:rPr>
+                <w:sz w:val="20"/>
+                <w:szCs w:val="20"/>
+              </w:rPr>
+              <w:t>register(</w:t>
+            </w:r>
+            <w:proofErr w:type="gramEnd"/>
+            <w:r>
+              <w:rPr>
+                <w:sz w:val="20"/>
+                <w:szCs w:val="20"/>
+              </w:rPr>
+              <w:t xml:space="preserve">), </w:t>
+            </w:r>
+            <w:proofErr w:type="gramStart"/>
+            <w:r>
+              <w:rPr>
+                <w:sz w:val="20"/>
+                <w:szCs w:val="20"/>
+              </w:rPr>
+              <w:t>login(</w:t>
+            </w:r>
+            <w:proofErr w:type="gramEnd"/>
+            <w:r>
+              <w:rPr>
+                <w:sz w:val="20"/>
+                <w:szCs w:val="20"/>
+              </w:rPr>
+              <w:t xml:space="preserve">), </w:t>
+            </w:r>
+            <w:proofErr w:type="spellStart"/>
+            <w:proofErr w:type="gramStart"/>
+            <w:r>
+              <w:rPr>
+                <w:sz w:val="20"/>
+                <w:szCs w:val="20"/>
+              </w:rPr>
+              <w:t>updateProfile</w:t>
+            </w:r>
+            <w:proofErr w:type="spellEnd"/>
+            <w:r>
+              <w:rPr>
+                <w:sz w:val="20"/>
+                <w:szCs w:val="20"/>
+              </w:rPr>
+              <w:t>(</w:t>
+            </w:r>
+            <w:proofErr w:type="gramEnd"/>
+            <w:r>
+              <w:rPr>
+                <w:sz w:val="20"/>
+                <w:szCs w:val="20"/>
+              </w:rPr>
+              <w:t>)</w:t>
             </w:r>
           </w:p>
         </w:tc>
@@ -670,12 +881,69 @@
             <w:tcW w:w="2300" w:type="dxa"/>
           </w:tcPr>
           <w:p>
-            <w:r>
-              <w:rPr>
-                <w:sz w:val="20"/>
-                <w:szCs w:val="20"/>
-              </w:rPr>
-              <w:t>Является базовым классом для Inspector, Analyst, Operator, Admin.</w:t>
+            <w:proofErr w:type="spellStart"/>
+            <w:r>
+              <w:rPr>
+                <w:sz w:val="20"/>
+                <w:szCs w:val="20"/>
+              </w:rPr>
+              <w:t>Является</w:t>
+            </w:r>
+            <w:proofErr w:type="spellEnd"/>
+            <w:r>
+              <w:rPr>
+                <w:sz w:val="20"/>
+                <w:szCs w:val="20"/>
+              </w:rPr>
+              <w:t xml:space="preserve"> </w:t>
+            </w:r>
+            <w:proofErr w:type="spellStart"/>
+            <w:r>
+              <w:rPr>
+                <w:sz w:val="20"/>
+                <w:szCs w:val="20"/>
+              </w:rPr>
+              <w:t>базовым</w:t>
+            </w:r>
+            <w:proofErr w:type="spellEnd"/>
+            <w:r>
+              <w:rPr>
+                <w:sz w:val="20"/>
+                <w:szCs w:val="20"/>
+              </w:rPr>
+              <w:t xml:space="preserve"> </w:t>
+            </w:r>
+            <w:proofErr w:type="spellStart"/>
+            <w:r>
+              <w:rPr>
+                <w:sz w:val="20"/>
+                <w:szCs w:val="20"/>
+              </w:rPr>
+              <w:t>классом</w:t>
+            </w:r>
+            <w:proofErr w:type="spellEnd"/>
+            <w:r>
+              <w:rPr>
+                <w:sz w:val="20"/>
+                <w:szCs w:val="20"/>
+              </w:rPr>
+              <w:t xml:space="preserve"> </w:t>
+            </w:r>
+            <w:proofErr w:type="spellStart"/>
+            <w:r>
+              <w:rPr>
+                <w:sz w:val="20"/>
+                <w:szCs w:val="20"/>
+              </w:rPr>
+              <w:t>для</w:t>
+            </w:r>
+            <w:proofErr w:type="spellEnd"/>
+            <w:r>
+              <w:rPr>
+                <w:sz w:val="20"/>
+                <w:szCs w:val="20"/>
+              </w:rPr>
+              <w:t xml:space="preserve"> Inspector, Analyst, Operator, Admin.</w:t>
             </w:r>
           </w:p>
         </w:tc>
@@ -700,12 +968,37 @@
             <w:tcW w:w="3000" w:type="dxa"/>
           </w:tcPr>
           <w:p>
-            <w:r>
-              <w:rPr>
-                <w:sz w:val="20"/>
-                <w:szCs w:val="20"/>
-              </w:rPr>
-              <w:t>assignedZones: UUID[]</w:t>
+            <w:proofErr w:type="spellStart"/>
+            <w:r>
+              <w:rPr>
+                <w:sz w:val="20"/>
+                <w:szCs w:val="20"/>
+              </w:rPr>
+              <w:t>assignedZones</w:t>
+            </w:r>
+            <w:proofErr w:type="spellEnd"/>
+            <w:r>
+              <w:rPr>
+                <w:sz w:val="20"/>
+                <w:szCs w:val="20"/>
+              </w:rPr>
+              <w:t xml:space="preserve">: </w:t>
+            </w:r>
+            <w:proofErr w:type="gramStart"/>
+            <w:r>
+              <w:rPr>
+                <w:sz w:val="20"/>
+                <w:szCs w:val="20"/>
+              </w:rPr>
+              <w:t>UUID[</w:t>
+            </w:r>
+            <w:proofErr w:type="gramEnd"/>
+            <w:r>
+              <w:rPr>
+                <w:sz w:val="20"/>
+                <w:szCs w:val="20"/>
+              </w:rPr>
+              <w:t>]</w:t>
             </w:r>
           </w:p>
         </w:tc>
@@ -714,12 +1007,80 @@
             <w:tcW w:w="2060" w:type="dxa"/>
           </w:tcPr>
           <w:p>
-            <w:r>
-              <w:rPr>
-                <w:sz w:val="20"/>
-                <w:szCs w:val="20"/>
-              </w:rPr>
-              <w:t>respondAlert(), closeAlert(), fileReport()</w:t>
+            <w:proofErr w:type="spellStart"/>
+            <w:proofErr w:type="gramStart"/>
+            <w:r>
+              <w:rPr>
+                <w:sz w:val="20"/>
+                <w:szCs w:val="20"/>
+              </w:rPr>
+              <w:t>respondAlert</w:t>
+            </w:r>
+            <w:proofErr w:type="spellEnd"/>
+            <w:r>
+              <w:rPr>
+                <w:sz w:val="20"/>
+                <w:szCs w:val="20"/>
+              </w:rPr>
+              <w:t>(</w:t>
+            </w:r>
+            <w:proofErr w:type="gramEnd"/>
+            <w:r>
+              <w:rPr>
+                <w:sz w:val="20"/>
+                <w:szCs w:val="20"/>
+              </w:rPr>
+              <w:t xml:space="preserve">), </w:t>
+            </w:r>
+            <w:proofErr w:type="spellStart"/>
+            <w:proofErr w:type="gramStart"/>
+            <w:r>
+              <w:rPr>
+                <w:sz w:val="20"/>
+                <w:szCs w:val="20"/>
+              </w:rPr>
+              <w:t>closeAlert</w:t>
+            </w:r>
+            <w:proofErr w:type="spellEnd"/>
+            <w:r>
+              <w:rPr>
+                <w:sz w:val="20"/>
+                <w:szCs w:val="20"/>
+              </w:rPr>
+              <w:t>(</w:t>
+            </w:r>
+            <w:proofErr w:type="gramEnd"/>
+            <w:r>
+              <w:rPr>
+                <w:sz w:val="20"/>
+                <w:szCs w:val="20"/>
+              </w:rPr>
+              <w:t xml:space="preserve">), </w:t>
+            </w:r>
+            <w:proofErr w:type="spellStart"/>
+            <w:proofErr w:type="gramStart"/>
+            <w:r>
+              <w:rPr>
+                <w:sz w:val="20"/>
+                <w:szCs w:val="20"/>
+              </w:rPr>
+              <w:t>fileReport</w:t>
+            </w:r>
+            <w:proofErr w:type="spellEnd"/>
+            <w:r>
+              <w:rPr>
+                <w:sz w:val="20"/>
+                <w:szCs w:val="20"/>
+              </w:rPr>
+              <w:t>(</w:t>
+            </w:r>
+            <w:proofErr w:type="gramEnd"/>
+            <w:r>
+              <w:rPr>
+                <w:sz w:val="20"/>
+                <w:szCs w:val="20"/>
+              </w:rPr>
+              <w:t>)</w:t>
             </w:r>
           </w:p>
         </w:tc>
@@ -771,6 +1132,7 @@
               </w:rPr>
               <w:t xml:space="preserve">, составляет </w:t>
             </w:r>
+            <w:proofErr w:type="spellStart"/>
             <w:r>
               <w:rPr>
                 <w:sz w:val="20"/>
@@ -778,6 +1140,7 @@
               </w:rPr>
               <w:t>IncidentReport</w:t>
             </w:r>
+            <w:proofErr w:type="spellEnd"/>
             <w:r>
               <w:rPr>
                 <w:sz w:val="20"/>
@@ -823,12 +1186,80 @@
             <w:tcW w:w="2060" w:type="dxa"/>
           </w:tcPr>
           <w:p>
-            <w:r>
-              <w:rPr>
-                <w:sz w:val="20"/>
-                <w:szCs w:val="20"/>
-              </w:rPr>
-              <w:t>queryArchive(), buildReport(), exportPDF()</w:t>
+            <w:proofErr w:type="spellStart"/>
+            <w:proofErr w:type="gramStart"/>
+            <w:r>
+              <w:rPr>
+                <w:sz w:val="20"/>
+                <w:szCs w:val="20"/>
+              </w:rPr>
+              <w:t>queryArchive</w:t>
+            </w:r>
+            <w:proofErr w:type="spellEnd"/>
+            <w:r>
+              <w:rPr>
+                <w:sz w:val="20"/>
+                <w:szCs w:val="20"/>
+              </w:rPr>
+              <w:t>(</w:t>
+            </w:r>
+            <w:proofErr w:type="gramEnd"/>
+            <w:r>
+              <w:rPr>
+                <w:sz w:val="20"/>
+                <w:szCs w:val="20"/>
+              </w:rPr>
+              <w:t xml:space="preserve">), </w:t>
+            </w:r>
+            <w:proofErr w:type="spellStart"/>
+            <w:proofErr w:type="gramStart"/>
+            <w:r>
+              <w:rPr>
+                <w:sz w:val="20"/>
+                <w:szCs w:val="20"/>
+              </w:rPr>
+              <w:t>buildReport</w:t>
+            </w:r>
+            <w:proofErr w:type="spellEnd"/>
+            <w:r>
+              <w:rPr>
+                <w:sz w:val="20"/>
+                <w:szCs w:val="20"/>
+              </w:rPr>
+              <w:t>(</w:t>
+            </w:r>
+            <w:proofErr w:type="gramEnd"/>
+            <w:r>
+              <w:rPr>
+                <w:sz w:val="20"/>
+                <w:szCs w:val="20"/>
+              </w:rPr>
+              <w:t xml:space="preserve">), </w:t>
+            </w:r>
+            <w:proofErr w:type="spellStart"/>
+            <w:proofErr w:type="gramStart"/>
+            <w:r>
+              <w:rPr>
+                <w:sz w:val="20"/>
+                <w:szCs w:val="20"/>
+              </w:rPr>
+              <w:t>exportPDF</w:t>
+            </w:r>
+            <w:proofErr w:type="spellEnd"/>
+            <w:r>
+              <w:rPr>
+                <w:sz w:val="20"/>
+                <w:szCs w:val="20"/>
+              </w:rPr>
+              <w:t>(</w:t>
+            </w:r>
+            <w:proofErr w:type="gramEnd"/>
+            <w:r>
+              <w:rPr>
+                <w:sz w:val="20"/>
+                <w:szCs w:val="20"/>
+              </w:rPr>
+              <w:t>)</w:t>
             </w:r>
           </w:p>
         </w:tc>
@@ -880,6 +1311,7 @@
               </w:rPr>
               <w:t xml:space="preserve"> на основе </w:t>
             </w:r>
+            <w:proofErr w:type="spellStart"/>
             <w:r>
               <w:rPr>
                 <w:sz w:val="20"/>
@@ -887,6 +1319,7 @@
               </w:rPr>
               <w:t>SensorReading</w:t>
             </w:r>
+            <w:proofErr w:type="spellEnd"/>
             <w:r>
               <w:rPr>
                 <w:sz w:val="20"/>
@@ -923,7 +1356,23 @@
                 <w:sz w:val="20"/>
                 <w:szCs w:val="20"/>
               </w:rPr>
-              <w:t>(нет)</w:t>
+              <w:t>(</w:t>
+            </w:r>
+            <w:proofErr w:type="spellStart"/>
+            <w:r>
+              <w:rPr>
+                <w:sz w:val="20"/>
+                <w:szCs w:val="20"/>
+              </w:rPr>
+              <w:t>нет</w:t>
+            </w:r>
+            <w:proofErr w:type="spellEnd"/>
+            <w:r>
+              <w:rPr>
+                <w:sz w:val="20"/>
+                <w:szCs w:val="20"/>
+              </w:rPr>
+              <w:t>)</w:t>
             </w:r>
           </w:p>
         </w:tc>
@@ -932,12 +1381,80 @@
             <w:tcW w:w="2060" w:type="dxa"/>
           </w:tcPr>
           <w:p>
-            <w:r>
-              <w:rPr>
-                <w:sz w:val="20"/>
-                <w:szCs w:val="20"/>
-              </w:rPr>
-              <w:t>checkDeviceStatus(), pollDevice(), fileTicket()</w:t>
+            <w:proofErr w:type="spellStart"/>
+            <w:proofErr w:type="gramStart"/>
+            <w:r>
+              <w:rPr>
+                <w:sz w:val="20"/>
+                <w:szCs w:val="20"/>
+              </w:rPr>
+              <w:t>checkDeviceStatus</w:t>
+            </w:r>
+            <w:proofErr w:type="spellEnd"/>
+            <w:r>
+              <w:rPr>
+                <w:sz w:val="20"/>
+                <w:szCs w:val="20"/>
+              </w:rPr>
+              <w:t>(</w:t>
+            </w:r>
+            <w:proofErr w:type="gramEnd"/>
+            <w:r>
+              <w:rPr>
+                <w:sz w:val="20"/>
+                <w:szCs w:val="20"/>
+              </w:rPr>
+              <w:t xml:space="preserve">), </w:t>
+            </w:r>
+            <w:proofErr w:type="spellStart"/>
+            <w:proofErr w:type="gramStart"/>
+            <w:r>
+              <w:rPr>
+                <w:sz w:val="20"/>
+                <w:szCs w:val="20"/>
+              </w:rPr>
+              <w:t>pollDevice</w:t>
+            </w:r>
+            <w:proofErr w:type="spellEnd"/>
+            <w:r>
+              <w:rPr>
+                <w:sz w:val="20"/>
+                <w:szCs w:val="20"/>
+              </w:rPr>
+              <w:t>(</w:t>
+            </w:r>
+            <w:proofErr w:type="gramEnd"/>
+            <w:r>
+              <w:rPr>
+                <w:sz w:val="20"/>
+                <w:szCs w:val="20"/>
+              </w:rPr>
+              <w:t xml:space="preserve">), </w:t>
+            </w:r>
+            <w:proofErr w:type="spellStart"/>
+            <w:proofErr w:type="gramStart"/>
+            <w:r>
+              <w:rPr>
+                <w:sz w:val="20"/>
+                <w:szCs w:val="20"/>
+              </w:rPr>
+              <w:t>fileTicket</w:t>
+            </w:r>
+            <w:proofErr w:type="spellEnd"/>
+            <w:r>
+              <w:rPr>
+                <w:sz w:val="20"/>
+                <w:szCs w:val="20"/>
+              </w:rPr>
+              <w:t>(</w:t>
+            </w:r>
+            <w:proofErr w:type="gramEnd"/>
+            <w:r>
+              <w:rPr>
+                <w:sz w:val="20"/>
+                <w:szCs w:val="20"/>
+              </w:rPr>
+              <w:t>)</w:t>
             </w:r>
           </w:p>
         </w:tc>
@@ -946,12 +1463,101 @@
             <w:tcW w:w="2300" w:type="dxa"/>
           </w:tcPr>
           <w:p>
-            <w:r>
-              <w:rPr>
-                <w:sz w:val="20"/>
-                <w:szCs w:val="20"/>
-              </w:rPr>
-              <w:t>Наследуется от User; создаёт ServiceTicket для SensorDevice.</w:t>
+            <w:proofErr w:type="spellStart"/>
+            <w:r>
+              <w:rPr>
+                <w:sz w:val="20"/>
+                <w:szCs w:val="20"/>
+              </w:rPr>
+              <w:t>Наследуется</w:t>
+            </w:r>
+            <w:proofErr w:type="spellEnd"/>
+            <w:r>
+              <w:rPr>
+                <w:sz w:val="20"/>
+                <w:szCs w:val="20"/>
+              </w:rPr>
+              <w:t xml:space="preserve"> </w:t>
+            </w:r>
+            <w:proofErr w:type="spellStart"/>
+            <w:r>
+              <w:rPr>
+                <w:sz w:val="20"/>
+                <w:szCs w:val="20"/>
+              </w:rPr>
+              <w:t>от</w:t>
+            </w:r>
+            <w:proofErr w:type="spellEnd"/>
+            <w:r>
+              <w:rPr>
+                <w:sz w:val="20"/>
+                <w:szCs w:val="20"/>
+              </w:rPr>
+              <w:t xml:space="preserve"> User; </w:t>
+            </w:r>
+            <w:proofErr w:type="spellStart"/>
+            <w:r>
+              <w:rPr>
+                <w:sz w:val="20"/>
+                <w:szCs w:val="20"/>
+              </w:rPr>
+              <w:t>создаёт</w:t>
+            </w:r>
+            <w:proofErr w:type="spellEnd"/>
+            <w:r>
+              <w:rPr>
+                <w:sz w:val="20"/>
+                <w:szCs w:val="20"/>
+              </w:rPr>
+              <w:t xml:space="preserve"> </w:t>
+            </w:r>
+            <w:proofErr w:type="spellStart"/>
+            <w:r>
+              <w:rPr>
+                <w:sz w:val="20"/>
+                <w:szCs w:val="20"/>
+              </w:rPr>
+              <w:t>ServiceTicket</w:t>
+            </w:r>
+            <w:proofErr w:type="spellEnd"/>
+            <w:r>
+              <w:rPr>
+                <w:sz w:val="20"/>
+                <w:szCs w:val="20"/>
+              </w:rPr>
+              <w:t xml:space="preserve"> </w:t>
+            </w:r>
+            <w:proofErr w:type="spellStart"/>
+            <w:r>
+              <w:rPr>
+                <w:sz w:val="20"/>
+                <w:szCs w:val="20"/>
+              </w:rPr>
+              <w:t>для</w:t>
+            </w:r>
+            <w:proofErr w:type="spellEnd"/>
+            <w:r>
+              <w:rPr>
+                <w:sz w:val="20"/>
+                <w:szCs w:val="20"/>
+              </w:rPr>
+              <w:t xml:space="preserve"> </w:t>
+            </w:r>
+            <w:proofErr w:type="spellStart"/>
+            <w:r>
+              <w:rPr>
+                <w:sz w:val="20"/>
+                <w:szCs w:val="20"/>
+              </w:rPr>
+              <w:t>SensorDevice</w:t>
+            </w:r>
+            <w:proofErr w:type="spellEnd"/>
+            <w:r>
+              <w:rPr>
+                <w:sz w:val="20"/>
+                <w:szCs w:val="20"/>
+              </w:rPr>
+              <w:t>.</w:t>
             </w:r>
           </w:p>
         </w:tc>
@@ -981,7 +1587,23 @@
                 <w:sz w:val="20"/>
                 <w:szCs w:val="20"/>
               </w:rPr>
-              <w:t>(нет)</w:t>
+              <w:t>(</w:t>
+            </w:r>
+            <w:proofErr w:type="spellStart"/>
+            <w:r>
+              <w:rPr>
+                <w:sz w:val="20"/>
+                <w:szCs w:val="20"/>
+              </w:rPr>
+              <w:t>нет</w:t>
+            </w:r>
+            <w:proofErr w:type="spellEnd"/>
+            <w:r>
+              <w:rPr>
+                <w:sz w:val="20"/>
+                <w:szCs w:val="20"/>
+              </w:rPr>
+              <w:t>)</w:t>
             </w:r>
           </w:p>
         </w:tc>
@@ -990,12 +1612,80 @@
             <w:tcW w:w="2060" w:type="dxa"/>
           </w:tcPr>
           <w:p>
-            <w:r>
-              <w:rPr>
-                <w:sz w:val="20"/>
-                <w:szCs w:val="20"/>
-              </w:rPr>
-              <w:t>registerDevice(), setThreshold(), manageUsers()</w:t>
+            <w:proofErr w:type="spellStart"/>
+            <w:proofErr w:type="gramStart"/>
+            <w:r>
+              <w:rPr>
+                <w:sz w:val="20"/>
+                <w:szCs w:val="20"/>
+              </w:rPr>
+              <w:t>registerDevice</w:t>
+            </w:r>
+            <w:proofErr w:type="spellEnd"/>
+            <w:r>
+              <w:rPr>
+                <w:sz w:val="20"/>
+                <w:szCs w:val="20"/>
+              </w:rPr>
+              <w:t>(</w:t>
+            </w:r>
+            <w:proofErr w:type="gramEnd"/>
+            <w:r>
+              <w:rPr>
+                <w:sz w:val="20"/>
+                <w:szCs w:val="20"/>
+              </w:rPr>
+              <w:t xml:space="preserve">), </w:t>
+            </w:r>
+            <w:proofErr w:type="spellStart"/>
+            <w:proofErr w:type="gramStart"/>
+            <w:r>
+              <w:rPr>
+                <w:sz w:val="20"/>
+                <w:szCs w:val="20"/>
+              </w:rPr>
+              <w:t>setThreshold</w:t>
+            </w:r>
+            <w:proofErr w:type="spellEnd"/>
+            <w:r>
+              <w:rPr>
+                <w:sz w:val="20"/>
+                <w:szCs w:val="20"/>
+              </w:rPr>
+              <w:t>(</w:t>
+            </w:r>
+            <w:proofErr w:type="gramEnd"/>
+            <w:r>
+              <w:rPr>
+                <w:sz w:val="20"/>
+                <w:szCs w:val="20"/>
+              </w:rPr>
+              <w:t xml:space="preserve">), </w:t>
+            </w:r>
+            <w:proofErr w:type="spellStart"/>
+            <w:proofErr w:type="gramStart"/>
+            <w:r>
+              <w:rPr>
+                <w:sz w:val="20"/>
+                <w:szCs w:val="20"/>
+              </w:rPr>
+              <w:t>manageUsers</w:t>
+            </w:r>
+            <w:proofErr w:type="spellEnd"/>
+            <w:r>
+              <w:rPr>
+                <w:sz w:val="20"/>
+                <w:szCs w:val="20"/>
+              </w:rPr>
+              <w:t>(</w:t>
+            </w:r>
+            <w:proofErr w:type="gramEnd"/>
+            <w:r>
+              <w:rPr>
+                <w:sz w:val="20"/>
+                <w:szCs w:val="20"/>
+              </w:rPr>
+              <w:t>)</w:t>
             </w:r>
           </w:p>
         </w:tc>
@@ -1032,6 +1722,7 @@
               </w:rPr>
               <w:t xml:space="preserve">; управляет </w:t>
             </w:r>
+            <w:proofErr w:type="spellStart"/>
             <w:r>
               <w:rPr>
                 <w:sz w:val="20"/>
@@ -1039,6 +1730,7 @@
               </w:rPr>
               <w:t>SensorDevice</w:t>
             </w:r>
+            <w:proofErr w:type="spellEnd"/>
             <w:r>
               <w:rPr>
                 <w:sz w:val="20"/>
@@ -1056,6 +1748,7 @@
             <w:tcW w:w="2000" w:type="dxa"/>
           </w:tcPr>
           <w:p>
+            <w:proofErr w:type="spellStart"/>
             <w:r>
               <w:rPr>
                 <w:sz w:val="20"/>
@@ -1063,6 +1756,7 @@
               </w:rPr>
               <w:t>SensorDevice</w:t>
             </w:r>
+            <w:proofErr w:type="spellEnd"/>
           </w:p>
         </w:tc>
         <w:tc>
@@ -1075,7 +1769,55 @@
                 <w:sz w:val="20"/>
                 <w:szCs w:val="20"/>
               </w:rPr>
-              <w:t>id, zoneId, type, location: GeoPoint, status: DeviceStatus, thresholds: Map</w:t>
+              <w:t xml:space="preserve">id, </w:t>
+            </w:r>
+            <w:proofErr w:type="spellStart"/>
+            <w:r>
+              <w:rPr>
+                <w:sz w:val="20"/>
+                <w:szCs w:val="20"/>
+              </w:rPr>
+              <w:t>zoneId</w:t>
+            </w:r>
+            <w:proofErr w:type="spellEnd"/>
+            <w:r>
+              <w:rPr>
+                <w:sz w:val="20"/>
+                <w:szCs w:val="20"/>
+              </w:rPr>
+              <w:t xml:space="preserve">, type, location: </w:t>
+            </w:r>
+            <w:proofErr w:type="spellStart"/>
+            <w:r>
+              <w:rPr>
+                <w:sz w:val="20"/>
+                <w:szCs w:val="20"/>
+              </w:rPr>
+              <w:t>GeoPoint</w:t>
+            </w:r>
+            <w:proofErr w:type="spellEnd"/>
+            <w:r>
+              <w:rPr>
+                <w:sz w:val="20"/>
+                <w:szCs w:val="20"/>
+              </w:rPr>
+              <w:t xml:space="preserve">, status: </w:t>
+            </w:r>
+            <w:proofErr w:type="spellStart"/>
+            <w:r>
+              <w:rPr>
+                <w:sz w:val="20"/>
+                <w:szCs w:val="20"/>
+              </w:rPr>
+              <w:t>DeviceStatus</w:t>
+            </w:r>
+            <w:proofErr w:type="spellEnd"/>
+            <w:r>
+              <w:rPr>
+                <w:sz w:val="20"/>
+                <w:szCs w:val="20"/>
+              </w:rPr>
+              <w:t>, thresholds: Map</w:t>
             </w:r>
           </w:p>
         </w:tc>
@@ -1084,12 +1826,80 @@
             <w:tcW w:w="2060" w:type="dxa"/>
           </w:tcPr>
           <w:p>
-            <w:r>
-              <w:rPr>
-                <w:sz w:val="20"/>
-                <w:szCs w:val="20"/>
-              </w:rPr>
-              <w:t>sendReading(), bufferOffline(), syncBatch()</w:t>
+            <w:proofErr w:type="spellStart"/>
+            <w:proofErr w:type="gramStart"/>
+            <w:r>
+              <w:rPr>
+                <w:sz w:val="20"/>
+                <w:szCs w:val="20"/>
+              </w:rPr>
+              <w:t>sendReading</w:t>
+            </w:r>
+            <w:proofErr w:type="spellEnd"/>
+            <w:r>
+              <w:rPr>
+                <w:sz w:val="20"/>
+                <w:szCs w:val="20"/>
+              </w:rPr>
+              <w:t>(</w:t>
+            </w:r>
+            <w:proofErr w:type="gramEnd"/>
+            <w:r>
+              <w:rPr>
+                <w:sz w:val="20"/>
+                <w:szCs w:val="20"/>
+              </w:rPr>
+              <w:t xml:space="preserve">), </w:t>
+            </w:r>
+            <w:proofErr w:type="spellStart"/>
+            <w:proofErr w:type="gramStart"/>
+            <w:r>
+              <w:rPr>
+                <w:sz w:val="20"/>
+                <w:szCs w:val="20"/>
+              </w:rPr>
+              <w:t>bufferOffline</w:t>
+            </w:r>
+            <w:proofErr w:type="spellEnd"/>
+            <w:r>
+              <w:rPr>
+                <w:sz w:val="20"/>
+                <w:szCs w:val="20"/>
+              </w:rPr>
+              <w:t>(</w:t>
+            </w:r>
+            <w:proofErr w:type="gramEnd"/>
+            <w:r>
+              <w:rPr>
+                <w:sz w:val="20"/>
+                <w:szCs w:val="20"/>
+              </w:rPr>
+              <w:t xml:space="preserve">), </w:t>
+            </w:r>
+            <w:proofErr w:type="spellStart"/>
+            <w:proofErr w:type="gramStart"/>
+            <w:r>
+              <w:rPr>
+                <w:sz w:val="20"/>
+                <w:szCs w:val="20"/>
+              </w:rPr>
+              <w:t>syncBatch</w:t>
+            </w:r>
+            <w:proofErr w:type="spellEnd"/>
+            <w:r>
+              <w:rPr>
+                <w:sz w:val="20"/>
+                <w:szCs w:val="20"/>
+              </w:rPr>
+              <w:t>(</w:t>
+            </w:r>
+            <w:proofErr w:type="gramEnd"/>
+            <w:r>
+              <w:rPr>
+                <w:sz w:val="20"/>
+                <w:szCs w:val="20"/>
+              </w:rPr>
+              <w:t>)</w:t>
             </w:r>
           </w:p>
         </w:tc>
@@ -1098,12 +1908,101 @@
             <w:tcW w:w="2300" w:type="dxa"/>
           </w:tcPr>
           <w:p>
-            <w:r>
-              <w:rPr>
-                <w:sz w:val="20"/>
-                <w:szCs w:val="20"/>
-              </w:rPr>
-              <w:t>Принадлежит Zone; создаёт SensorReading; является объектом ServiceTicket.</w:t>
+            <w:proofErr w:type="spellStart"/>
+            <w:r>
+              <w:rPr>
+                <w:sz w:val="20"/>
+                <w:szCs w:val="20"/>
+              </w:rPr>
+              <w:t>Принадлежит</w:t>
+            </w:r>
+            <w:proofErr w:type="spellEnd"/>
+            <w:r>
+              <w:rPr>
+                <w:sz w:val="20"/>
+                <w:szCs w:val="20"/>
+              </w:rPr>
+              <w:t xml:space="preserve"> Zone; </w:t>
+            </w:r>
+            <w:proofErr w:type="spellStart"/>
+            <w:r>
+              <w:rPr>
+                <w:sz w:val="20"/>
+                <w:szCs w:val="20"/>
+              </w:rPr>
+              <w:t>создаёт</w:t>
+            </w:r>
+            <w:proofErr w:type="spellEnd"/>
+            <w:r>
+              <w:rPr>
+                <w:sz w:val="20"/>
+                <w:szCs w:val="20"/>
+              </w:rPr>
+              <w:t xml:space="preserve"> </w:t>
+            </w:r>
+            <w:proofErr w:type="spellStart"/>
+            <w:r>
+              <w:rPr>
+                <w:sz w:val="20"/>
+                <w:szCs w:val="20"/>
+              </w:rPr>
+              <w:t>SensorReading</w:t>
+            </w:r>
+            <w:proofErr w:type="spellEnd"/>
+            <w:r>
+              <w:rPr>
+                <w:sz w:val="20"/>
+                <w:szCs w:val="20"/>
+              </w:rPr>
+              <w:t xml:space="preserve">; </w:t>
+            </w:r>
+            <w:proofErr w:type="spellStart"/>
+            <w:r>
+              <w:rPr>
+                <w:sz w:val="20"/>
+                <w:szCs w:val="20"/>
+              </w:rPr>
+              <w:t>является</w:t>
+            </w:r>
+            <w:proofErr w:type="spellEnd"/>
+            <w:r>
+              <w:rPr>
+                <w:sz w:val="20"/>
+                <w:szCs w:val="20"/>
+              </w:rPr>
+              <w:t xml:space="preserve"> </w:t>
+            </w:r>
+            <w:proofErr w:type="spellStart"/>
+            <w:r>
+              <w:rPr>
+                <w:sz w:val="20"/>
+                <w:szCs w:val="20"/>
+              </w:rPr>
+              <w:t>объектом</w:t>
+            </w:r>
+            <w:proofErr w:type="spellEnd"/>
+            <w:r>
+              <w:rPr>
+                <w:sz w:val="20"/>
+                <w:szCs w:val="20"/>
+              </w:rPr>
+              <w:t xml:space="preserve"> </w:t>
+            </w:r>
+            <w:proofErr w:type="spellStart"/>
+            <w:r>
+              <w:rPr>
+                <w:sz w:val="20"/>
+                <w:szCs w:val="20"/>
+              </w:rPr>
+              <w:t>ServiceTicket</w:t>
+            </w:r>
+            <w:proofErr w:type="spellEnd"/>
+            <w:r>
+              <w:rPr>
+                <w:sz w:val="20"/>
+                <w:szCs w:val="20"/>
+              </w:rPr>
+              <w:t>.</w:t>
             </w:r>
           </w:p>
         </w:tc>
@@ -1142,12 +2041,55 @@
             <w:tcW w:w="2060" w:type="dxa"/>
           </w:tcPr>
           <w:p>
-            <w:r>
-              <w:rPr>
-                <w:sz w:val="20"/>
-                <w:szCs w:val="20"/>
-              </w:rPr>
-              <w:t>addDevice(), getActiveAlerts()</w:t>
+            <w:proofErr w:type="spellStart"/>
+            <w:proofErr w:type="gramStart"/>
+            <w:r>
+              <w:rPr>
+                <w:sz w:val="20"/>
+                <w:szCs w:val="20"/>
+              </w:rPr>
+              <w:t>addDevice</w:t>
+            </w:r>
+            <w:proofErr w:type="spellEnd"/>
+            <w:r>
+              <w:rPr>
+                <w:sz w:val="20"/>
+                <w:szCs w:val="20"/>
+              </w:rPr>
+              <w:t>(</w:t>
+            </w:r>
+            <w:proofErr w:type="gramEnd"/>
+            <w:r>
+              <w:rPr>
+                <w:sz w:val="20"/>
+                <w:szCs w:val="20"/>
+              </w:rPr>
+              <w:t xml:space="preserve">), </w:t>
+            </w:r>
+            <w:proofErr w:type="spellStart"/>
+            <w:proofErr w:type="gramStart"/>
+            <w:r>
+              <w:rPr>
+                <w:sz w:val="20"/>
+                <w:szCs w:val="20"/>
+              </w:rPr>
+              <w:t>getActiveAlerts</w:t>
+            </w:r>
+            <w:proofErr w:type="spellEnd"/>
+            <w:r>
+              <w:rPr>
+                <w:sz w:val="20"/>
+                <w:szCs w:val="20"/>
+              </w:rPr>
+              <w:t>(</w:t>
+            </w:r>
+            <w:proofErr w:type="gramEnd"/>
+            <w:r>
+              <w:rPr>
+                <w:sz w:val="20"/>
+                <w:szCs w:val="20"/>
+              </w:rPr>
+              <w:t>)</w:t>
             </w:r>
           </w:p>
         </w:tc>
@@ -1169,6 +2111,7 @@
               </w:rPr>
               <w:t xml:space="preserve">Содержит </w:t>
             </w:r>
+            <w:proofErr w:type="spellStart"/>
             <w:r>
               <w:rPr>
                 <w:sz w:val="20"/>
@@ -1176,6 +2119,7 @@
               </w:rPr>
               <w:t>SensorDevice</w:t>
             </w:r>
+            <w:proofErr w:type="spellEnd"/>
             <w:r>
               <w:rPr>
                 <w:sz w:val="20"/>
@@ -1223,6 +2167,7 @@
             <w:tcW w:w="2000" w:type="dxa"/>
           </w:tcPr>
           <w:p>
+            <w:proofErr w:type="spellStart"/>
             <w:r>
               <w:rPr>
                 <w:sz w:val="20"/>
@@ -1230,6 +2175,7 @@
               </w:rPr>
               <w:t>SensorReading</w:t>
             </w:r>
+            <w:proofErr w:type="spellEnd"/>
           </w:p>
         </w:tc>
         <w:tc>
@@ -1242,7 +2188,87 @@
                 <w:sz w:val="20"/>
                 <w:szCs w:val="20"/>
               </w:rPr>
-              <w:t>id, deviceId, zoneId, paramType: ParamType, value: double, unit, measuredAt: datetime</w:t>
+              <w:t xml:space="preserve">id, </w:t>
+            </w:r>
+            <w:proofErr w:type="spellStart"/>
+            <w:r>
+              <w:rPr>
+                <w:sz w:val="20"/>
+                <w:szCs w:val="20"/>
+              </w:rPr>
+              <w:t>deviceId</w:t>
+            </w:r>
+            <w:proofErr w:type="spellEnd"/>
+            <w:r>
+              <w:rPr>
+                <w:sz w:val="20"/>
+                <w:szCs w:val="20"/>
+              </w:rPr>
+              <w:t xml:space="preserve">, </w:t>
+            </w:r>
+            <w:proofErr w:type="spellStart"/>
+            <w:r>
+              <w:rPr>
+                <w:sz w:val="20"/>
+                <w:szCs w:val="20"/>
+              </w:rPr>
+              <w:t>zoneId</w:t>
+            </w:r>
+            <w:proofErr w:type="spellEnd"/>
+            <w:r>
+              <w:rPr>
+                <w:sz w:val="20"/>
+                <w:szCs w:val="20"/>
+              </w:rPr>
+              <w:t xml:space="preserve">, </w:t>
+            </w:r>
+            <w:proofErr w:type="spellStart"/>
+            <w:r>
+              <w:rPr>
+                <w:sz w:val="20"/>
+                <w:szCs w:val="20"/>
+              </w:rPr>
+              <w:t>paramType</w:t>
+            </w:r>
+            <w:proofErr w:type="spellEnd"/>
+            <w:r>
+              <w:rPr>
+                <w:sz w:val="20"/>
+                <w:szCs w:val="20"/>
+              </w:rPr>
+              <w:t xml:space="preserve">: </w:t>
+            </w:r>
+            <w:proofErr w:type="spellStart"/>
+            <w:r>
+              <w:rPr>
+                <w:sz w:val="20"/>
+                <w:szCs w:val="20"/>
+              </w:rPr>
+              <w:t>ParamType</w:t>
+            </w:r>
+            <w:proofErr w:type="spellEnd"/>
+            <w:r>
+              <w:rPr>
+                <w:sz w:val="20"/>
+                <w:szCs w:val="20"/>
+              </w:rPr>
+              <w:t xml:space="preserve">, value: double, unit, </w:t>
+            </w:r>
+            <w:proofErr w:type="spellStart"/>
+            <w:r>
+              <w:rPr>
+                <w:sz w:val="20"/>
+                <w:szCs w:val="20"/>
+              </w:rPr>
+              <w:t>measuredAt</w:t>
+            </w:r>
+            <w:proofErr w:type="spellEnd"/>
+            <w:r>
+              <w:rPr>
+                <w:sz w:val="20"/>
+                <w:szCs w:val="20"/>
+              </w:rPr>
+              <w:t>: datetime</w:t>
             </w:r>
           </w:p>
         </w:tc>
@@ -1251,12 +2277,46 @@
             <w:tcW w:w="2060" w:type="dxa"/>
           </w:tcPr>
           <w:p>
-            <w:r>
-              <w:rPr>
-                <w:sz w:val="20"/>
-                <w:szCs w:val="20"/>
-              </w:rPr>
-              <w:t>validate(), checkThreshold()</w:t>
+            <w:proofErr w:type="gramStart"/>
+            <w:r>
+              <w:rPr>
+                <w:sz w:val="20"/>
+                <w:szCs w:val="20"/>
+              </w:rPr>
+              <w:t>validate(</w:t>
+            </w:r>
+            <w:proofErr w:type="gramEnd"/>
+            <w:r>
+              <w:rPr>
+                <w:sz w:val="20"/>
+                <w:szCs w:val="20"/>
+              </w:rPr>
+              <w:t xml:space="preserve">), </w:t>
+            </w:r>
+            <w:proofErr w:type="spellStart"/>
+            <w:proofErr w:type="gramStart"/>
+            <w:r>
+              <w:rPr>
+                <w:sz w:val="20"/>
+                <w:szCs w:val="20"/>
+              </w:rPr>
+              <w:t>checkThreshold</w:t>
+            </w:r>
+            <w:proofErr w:type="spellEnd"/>
+            <w:r>
+              <w:rPr>
+                <w:sz w:val="20"/>
+                <w:szCs w:val="20"/>
+              </w:rPr>
+              <w:t>(</w:t>
+            </w:r>
+            <w:proofErr w:type="gramEnd"/>
+            <w:r>
+              <w:rPr>
+                <w:sz w:val="20"/>
+                <w:szCs w:val="20"/>
+              </w:rPr>
+              <w:t>)</w:t>
             </w:r>
           </w:p>
         </w:tc>
@@ -1278,6 +2338,7 @@
               </w:rPr>
               <w:t xml:space="preserve">Создаётся </w:t>
             </w:r>
+            <w:proofErr w:type="spellStart"/>
             <w:r>
               <w:rPr>
                 <w:sz w:val="20"/>
@@ -1285,6 +2346,7 @@
               </w:rPr>
               <w:t>SensorDevice</w:t>
             </w:r>
+            <w:proofErr w:type="spellEnd"/>
             <w:r>
               <w:rPr>
                 <w:sz w:val="20"/>
@@ -1336,7 +2398,87 @@
                 <w:sz w:val="20"/>
                 <w:szCs w:val="20"/>
               </w:rPr>
-              <w:t>id, deviceId, zoneId, paramType, value, threshold, status: AlertStatus, createdAt: datetime</w:t>
+              <w:t xml:space="preserve">id, </w:t>
+            </w:r>
+            <w:proofErr w:type="spellStart"/>
+            <w:r>
+              <w:rPr>
+                <w:sz w:val="20"/>
+                <w:szCs w:val="20"/>
+              </w:rPr>
+              <w:t>deviceId</w:t>
+            </w:r>
+            <w:proofErr w:type="spellEnd"/>
+            <w:r>
+              <w:rPr>
+                <w:sz w:val="20"/>
+                <w:szCs w:val="20"/>
+              </w:rPr>
+              <w:t xml:space="preserve">, </w:t>
+            </w:r>
+            <w:proofErr w:type="spellStart"/>
+            <w:r>
+              <w:rPr>
+                <w:sz w:val="20"/>
+                <w:szCs w:val="20"/>
+              </w:rPr>
+              <w:t>zoneId</w:t>
+            </w:r>
+            <w:proofErr w:type="spellEnd"/>
+            <w:r>
+              <w:rPr>
+                <w:sz w:val="20"/>
+                <w:szCs w:val="20"/>
+              </w:rPr>
+              <w:t xml:space="preserve">, </w:t>
+            </w:r>
+            <w:proofErr w:type="spellStart"/>
+            <w:r>
+              <w:rPr>
+                <w:sz w:val="20"/>
+                <w:szCs w:val="20"/>
+              </w:rPr>
+              <w:t>paramType</w:t>
+            </w:r>
+            <w:proofErr w:type="spellEnd"/>
+            <w:r>
+              <w:rPr>
+                <w:sz w:val="20"/>
+                <w:szCs w:val="20"/>
+              </w:rPr>
+              <w:t xml:space="preserve">, value, threshold, status: </w:t>
+            </w:r>
+            <w:proofErr w:type="spellStart"/>
+            <w:r>
+              <w:rPr>
+                <w:sz w:val="20"/>
+                <w:szCs w:val="20"/>
+              </w:rPr>
+              <w:t>AlertStatus</w:t>
+            </w:r>
+            <w:proofErr w:type="spellEnd"/>
+            <w:r>
+              <w:rPr>
+                <w:sz w:val="20"/>
+                <w:szCs w:val="20"/>
+              </w:rPr>
+              <w:t xml:space="preserve">, </w:t>
+            </w:r>
+            <w:proofErr w:type="spellStart"/>
+            <w:r>
+              <w:rPr>
+                <w:sz w:val="20"/>
+                <w:szCs w:val="20"/>
+              </w:rPr>
+              <w:t>createdAt</w:t>
+            </w:r>
+            <w:proofErr w:type="spellEnd"/>
+            <w:r>
+              <w:rPr>
+                <w:sz w:val="20"/>
+                <w:szCs w:val="20"/>
+              </w:rPr>
+              <w:t>: datetime</w:t>
             </w:r>
           </w:p>
         </w:tc>
@@ -1345,12 +2487,53 @@
             <w:tcW w:w="2060" w:type="dxa"/>
           </w:tcPr>
           <w:p>
-            <w:r>
-              <w:rPr>
-                <w:sz w:val="20"/>
-                <w:szCs w:val="20"/>
-              </w:rPr>
-              <w:t>create(), close(), assign()</w:t>
+            <w:proofErr w:type="gramStart"/>
+            <w:r>
+              <w:rPr>
+                <w:sz w:val="20"/>
+                <w:szCs w:val="20"/>
+              </w:rPr>
+              <w:t>create(</w:t>
+            </w:r>
+            <w:proofErr w:type="gramEnd"/>
+            <w:r>
+              <w:rPr>
+                <w:sz w:val="20"/>
+                <w:szCs w:val="20"/>
+              </w:rPr>
+              <w:t xml:space="preserve">), </w:t>
+            </w:r>
+            <w:proofErr w:type="gramStart"/>
+            <w:r>
+              <w:rPr>
+                <w:sz w:val="20"/>
+                <w:szCs w:val="20"/>
+              </w:rPr>
+              <w:t>close(</w:t>
+            </w:r>
+            <w:proofErr w:type="gramEnd"/>
+            <w:r>
+              <w:rPr>
+                <w:sz w:val="20"/>
+                <w:szCs w:val="20"/>
+              </w:rPr>
+              <w:t xml:space="preserve">), </w:t>
+            </w:r>
+            <w:proofErr w:type="gramStart"/>
+            <w:r>
+              <w:rPr>
+                <w:sz w:val="20"/>
+                <w:szCs w:val="20"/>
+              </w:rPr>
+              <w:t>assign(</w:t>
+            </w:r>
+            <w:proofErr w:type="gramEnd"/>
+            <w:r>
+              <w:rPr>
+                <w:sz w:val="20"/>
+                <w:szCs w:val="20"/>
+              </w:rPr>
+              <w:t>)</w:t>
             </w:r>
           </w:p>
         </w:tc>
@@ -1359,20 +2542,102 @@
             <w:tcW w:w="2300" w:type="dxa"/>
           </w:tcPr>
           <w:p>
-            <w:r>
-              <w:rPr>
-                <w:sz w:val="20"/>
-                <w:szCs w:val="20"/>
-              </w:rPr>
-              <w:t xml:space="preserve">Порождается SensorReading; закрывается через </w:t>
-            </w:r>
+            <w:proofErr w:type="spellStart"/>
+            <w:r>
+              <w:rPr>
+                <w:sz w:val="20"/>
+                <w:szCs w:val="20"/>
+              </w:rPr>
+              <w:t>Порождается</w:t>
+            </w:r>
+            <w:proofErr w:type="spellEnd"/>
+            <w:r>
+              <w:rPr>
+                <w:sz w:val="20"/>
+                <w:szCs w:val="20"/>
+              </w:rPr>
+              <w:t xml:space="preserve"> </w:t>
+            </w:r>
+            <w:proofErr w:type="spellStart"/>
+            <w:r>
+              <w:rPr>
+                <w:sz w:val="20"/>
+                <w:szCs w:val="20"/>
+              </w:rPr>
+              <w:t>SensorReading</w:t>
+            </w:r>
+            <w:proofErr w:type="spellEnd"/>
+            <w:r>
+              <w:rPr>
+                <w:sz w:val="20"/>
+                <w:szCs w:val="20"/>
+              </w:rPr>
+              <w:t xml:space="preserve">; </w:t>
+            </w:r>
+            <w:proofErr w:type="spellStart"/>
+            <w:r>
+              <w:rPr>
+                <w:sz w:val="20"/>
+                <w:szCs w:val="20"/>
+              </w:rPr>
+              <w:t>закрывается</w:t>
+            </w:r>
+            <w:proofErr w:type="spellEnd"/>
+            <w:r>
+              <w:rPr>
+                <w:sz w:val="20"/>
+                <w:szCs w:val="20"/>
+              </w:rPr>
+              <w:t xml:space="preserve"> </w:t>
+            </w:r>
+            <w:proofErr w:type="spellStart"/>
+            <w:r>
+              <w:rPr>
+                <w:sz w:val="20"/>
+                <w:szCs w:val="20"/>
+              </w:rPr>
+              <w:t>через</w:t>
+            </w:r>
+            <w:proofErr w:type="spellEnd"/>
+            <w:r>
+              <w:rPr>
+                <w:sz w:val="20"/>
+                <w:szCs w:val="20"/>
+              </w:rPr>
+              <w:t xml:space="preserve"> </w:t>
+            </w:r>
+            <w:proofErr w:type="spellStart"/>
             <w:r>
               <w:rPr>
                 <w:sz w:val="20"/>
                 <w:szCs w:val="20"/>
               </w:rPr>
               <w:lastRenderedPageBreak/>
-              <w:t>IncidentReport; порождает Notification.</w:t>
+              <w:t>IncidentReport</w:t>
+            </w:r>
+            <w:proofErr w:type="spellEnd"/>
+            <w:r>
+              <w:rPr>
+                <w:sz w:val="20"/>
+                <w:szCs w:val="20"/>
+              </w:rPr>
+              <w:t xml:space="preserve">; </w:t>
+            </w:r>
+            <w:proofErr w:type="spellStart"/>
+            <w:r>
+              <w:rPr>
+                <w:sz w:val="20"/>
+                <w:szCs w:val="20"/>
+              </w:rPr>
+              <w:t>порождает</w:t>
+            </w:r>
+            <w:proofErr w:type="spellEnd"/>
+            <w:r>
+              <w:rPr>
+                <w:sz w:val="20"/>
+                <w:szCs w:val="20"/>
+              </w:rPr>
+              <w:t xml:space="preserve"> Notification.</w:t>
             </w:r>
           </w:p>
         </w:tc>
@@ -1403,8 +2668,65 @@
                 <w:sz w:val="20"/>
                 <w:szCs w:val="20"/>
               </w:rPr>
-              <w:t>id, alertId, userId, channel, sentAt, status: DeliveryStatus</w:t>
-            </w:r>
+              <w:t xml:space="preserve">id, </w:t>
+            </w:r>
+            <w:proofErr w:type="spellStart"/>
+            <w:r>
+              <w:rPr>
+                <w:sz w:val="20"/>
+                <w:szCs w:val="20"/>
+              </w:rPr>
+              <w:t>alertId</w:t>
+            </w:r>
+            <w:proofErr w:type="spellEnd"/>
+            <w:r>
+              <w:rPr>
+                <w:sz w:val="20"/>
+                <w:szCs w:val="20"/>
+              </w:rPr>
+              <w:t xml:space="preserve">, </w:t>
+            </w:r>
+            <w:proofErr w:type="spellStart"/>
+            <w:r>
+              <w:rPr>
+                <w:sz w:val="20"/>
+                <w:szCs w:val="20"/>
+              </w:rPr>
+              <w:t>userId</w:t>
+            </w:r>
+            <w:proofErr w:type="spellEnd"/>
+            <w:r>
+              <w:rPr>
+                <w:sz w:val="20"/>
+                <w:szCs w:val="20"/>
+              </w:rPr>
+              <w:t xml:space="preserve">, channel, </w:t>
+            </w:r>
+            <w:proofErr w:type="spellStart"/>
+            <w:r>
+              <w:rPr>
+                <w:sz w:val="20"/>
+                <w:szCs w:val="20"/>
+              </w:rPr>
+              <w:t>sentAt</w:t>
+            </w:r>
+            <w:proofErr w:type="spellEnd"/>
+            <w:r>
+              <w:rPr>
+                <w:sz w:val="20"/>
+                <w:szCs w:val="20"/>
+              </w:rPr>
+              <w:t xml:space="preserve">, status: </w:t>
+            </w:r>
+            <w:proofErr w:type="spellStart"/>
+            <w:r>
+              <w:rPr>
+                <w:sz w:val="20"/>
+                <w:szCs w:val="20"/>
+              </w:rPr>
+              <w:t>DeliveryStatus</w:t>
+            </w:r>
+            <w:proofErr w:type="spellEnd"/>
           </w:p>
         </w:tc>
         <w:tc>
@@ -1412,12 +2734,46 @@
             <w:tcW w:w="2060" w:type="dxa"/>
           </w:tcPr>
           <w:p>
-            <w:r>
-              <w:rPr>
-                <w:sz w:val="20"/>
-                <w:szCs w:val="20"/>
-              </w:rPr>
-              <w:t>send(), markDelivered()</w:t>
+            <w:proofErr w:type="gramStart"/>
+            <w:r>
+              <w:rPr>
+                <w:sz w:val="20"/>
+                <w:szCs w:val="20"/>
+              </w:rPr>
+              <w:t>send(</w:t>
+            </w:r>
+            <w:proofErr w:type="gramEnd"/>
+            <w:r>
+              <w:rPr>
+                <w:sz w:val="20"/>
+                <w:szCs w:val="20"/>
+              </w:rPr>
+              <w:t xml:space="preserve">), </w:t>
+            </w:r>
+            <w:proofErr w:type="spellStart"/>
+            <w:proofErr w:type="gramStart"/>
+            <w:r>
+              <w:rPr>
+                <w:sz w:val="20"/>
+                <w:szCs w:val="20"/>
+              </w:rPr>
+              <w:t>markDelivered</w:t>
+            </w:r>
+            <w:proofErr w:type="spellEnd"/>
+            <w:r>
+              <w:rPr>
+                <w:sz w:val="20"/>
+                <w:szCs w:val="20"/>
+              </w:rPr>
+              <w:t>(</w:t>
+            </w:r>
+            <w:proofErr w:type="gramEnd"/>
+            <w:r>
+              <w:rPr>
+                <w:sz w:val="20"/>
+                <w:szCs w:val="20"/>
+              </w:rPr>
+              <w:t>)</w:t>
             </w:r>
           </w:p>
         </w:tc>
@@ -1493,6 +2849,7 @@
             <w:tcW w:w="2000" w:type="dxa"/>
           </w:tcPr>
           <w:p>
+            <w:proofErr w:type="spellStart"/>
             <w:r>
               <w:rPr>
                 <w:sz w:val="20"/>
@@ -1500,6 +2857,7 @@
               </w:rPr>
               <w:t>IncidentReport</w:t>
             </w:r>
+            <w:proofErr w:type="spellEnd"/>
           </w:p>
         </w:tc>
         <w:tc>
@@ -1512,7 +2870,62 @@
                 <w:sz w:val="20"/>
                 <w:szCs w:val="20"/>
               </w:rPr>
-              <w:t>id, alertId, inspectorId, description, outcome, createdAt</w:t>
+              <w:t xml:space="preserve">id, </w:t>
+            </w:r>
+            <w:proofErr w:type="spellStart"/>
+            <w:r>
+              <w:rPr>
+                <w:sz w:val="20"/>
+                <w:szCs w:val="20"/>
+              </w:rPr>
+              <w:t>alertId</w:t>
+            </w:r>
+            <w:proofErr w:type="spellEnd"/>
+            <w:r>
+              <w:rPr>
+                <w:sz w:val="20"/>
+                <w:szCs w:val="20"/>
+              </w:rPr>
+              <w:t xml:space="preserve">, </w:t>
+            </w:r>
+            <w:proofErr w:type="spellStart"/>
+            <w:r>
+              <w:rPr>
+                <w:sz w:val="20"/>
+                <w:szCs w:val="20"/>
+              </w:rPr>
+              <w:t>inspectorId</w:t>
+            </w:r>
+            <w:proofErr w:type="spellEnd"/>
+            <w:r>
+              <w:rPr>
+                <w:sz w:val="20"/>
+                <w:szCs w:val="20"/>
+              </w:rPr>
+              <w:t xml:space="preserve">, description, outcome, </w:t>
+            </w:r>
+            <w:proofErr w:type="spellStart"/>
+            <w:r>
+              <w:rPr>
+                <w:sz w:val="20"/>
+                <w:szCs w:val="20"/>
+              </w:rPr>
+              <w:t>createdAt</w:t>
+            </w:r>
+            <w:proofErr w:type="spellEnd"/>
+            <w:r>
+              <w:rPr>
+                <w:sz w:val="20"/>
+                <w:szCs w:val="20"/>
+              </w:rPr>
+              <w:t xml:space="preserve">, </w:t>
+            </w:r>
+            <w:r>
+              <w:rPr>
+                <w:sz w:val="20"/>
+                <w:szCs w:val="20"/>
+              </w:rPr>
+              <w:t>departedAt</w:t>
             </w:r>
           </w:p>
         </w:tc>
@@ -1521,12 +2934,37 @@
             <w:tcW w:w="2060" w:type="dxa"/>
           </w:tcPr>
           <w:p>
-            <w:r>
-              <w:rPr>
-                <w:sz w:val="20"/>
-                <w:szCs w:val="20"/>
-              </w:rPr>
-              <w:t>save(), close()</w:t>
+            <w:proofErr w:type="gramStart"/>
+            <w:r>
+              <w:rPr>
+                <w:sz w:val="20"/>
+                <w:szCs w:val="20"/>
+              </w:rPr>
+              <w:t>save(</w:t>
+            </w:r>
+            <w:proofErr w:type="gramEnd"/>
+            <w:r>
+              <w:rPr>
+                <w:sz w:val="20"/>
+                <w:szCs w:val="20"/>
+              </w:rPr>
+              <w:t xml:space="preserve">), </w:t>
+            </w:r>
+            <w:proofErr w:type="gramStart"/>
+            <w:r>
+              <w:rPr>
+                <w:sz w:val="20"/>
+                <w:szCs w:val="20"/>
+              </w:rPr>
+              <w:t>close(</w:t>
+            </w:r>
+            <w:proofErr w:type="gramEnd"/>
+            <w:r>
+              <w:rPr>
+                <w:sz w:val="20"/>
+                <w:szCs w:val="20"/>
+              </w:rPr>
+              <w:t>)</w:t>
             </w:r>
           </w:p>
         </w:tc>
@@ -1606,8 +3044,97 @@
                 <w:sz w:val="20"/>
                 <w:szCs w:val="20"/>
               </w:rPr>
-              <w:t>id, analystId, zoneId, dateFrom, dateTo, paramType, fileUrl</w:t>
-            </w:r>
+              <w:t xml:space="preserve">id, </w:t>
+            </w:r>
+            <w:proofErr w:type="spellStart"/>
+            <w:r>
+              <w:rPr>
+                <w:sz w:val="20"/>
+                <w:szCs w:val="20"/>
+              </w:rPr>
+              <w:t>analystId</w:t>
+            </w:r>
+            <w:proofErr w:type="spellEnd"/>
+            <w:r>
+              <w:rPr>
+                <w:sz w:val="20"/>
+                <w:szCs w:val="20"/>
+              </w:rPr>
+              <w:t xml:space="preserve">, </w:t>
+            </w:r>
+            <w:proofErr w:type="spellStart"/>
+            <w:r>
+              <w:rPr>
+                <w:sz w:val="20"/>
+                <w:szCs w:val="20"/>
+              </w:rPr>
+              <w:t>zoneId</w:t>
+            </w:r>
+            <w:proofErr w:type="spellEnd"/>
+            <w:r>
+              <w:rPr>
+                <w:sz w:val="20"/>
+                <w:szCs w:val="20"/>
+              </w:rPr>
+              <w:t xml:space="preserve">, </w:t>
+            </w:r>
+            <w:proofErr w:type="spellStart"/>
+            <w:r>
+              <w:rPr>
+                <w:sz w:val="20"/>
+                <w:szCs w:val="20"/>
+              </w:rPr>
+              <w:t>dateFrom</w:t>
+            </w:r>
+            <w:proofErr w:type="spellEnd"/>
+            <w:r>
+              <w:rPr>
+                <w:sz w:val="20"/>
+                <w:szCs w:val="20"/>
+              </w:rPr>
+              <w:t xml:space="preserve">, </w:t>
+            </w:r>
+            <w:proofErr w:type="spellStart"/>
+            <w:r>
+              <w:rPr>
+                <w:sz w:val="20"/>
+                <w:szCs w:val="20"/>
+              </w:rPr>
+              <w:t>dateTo</w:t>
+            </w:r>
+            <w:proofErr w:type="spellEnd"/>
+            <w:r>
+              <w:rPr>
+                <w:sz w:val="20"/>
+                <w:szCs w:val="20"/>
+              </w:rPr>
+              <w:t xml:space="preserve">, </w:t>
+            </w:r>
+            <w:proofErr w:type="spellStart"/>
+            <w:r>
+              <w:rPr>
+                <w:sz w:val="20"/>
+                <w:szCs w:val="20"/>
+              </w:rPr>
+              <w:t>paramType</w:t>
+            </w:r>
+            <w:proofErr w:type="spellEnd"/>
+            <w:r>
+              <w:rPr>
+                <w:sz w:val="20"/>
+                <w:szCs w:val="20"/>
+              </w:rPr>
+              <w:t xml:space="preserve">, </w:t>
+            </w:r>
+            <w:proofErr w:type="spellStart"/>
+            <w:r>
+              <w:rPr>
+                <w:sz w:val="20"/>
+                <w:szCs w:val="20"/>
+              </w:rPr>
+              <w:t>fileUrl</w:t>
+            </w:r>
+            <w:proofErr w:type="spellEnd"/>
           </w:p>
         </w:tc>
         <w:tc>
@@ -1615,12 +3142,46 @@
             <w:tcW w:w="2060" w:type="dxa"/>
           </w:tcPr>
           <w:p>
-            <w:r>
-              <w:rPr>
-                <w:sz w:val="20"/>
-                <w:szCs w:val="20"/>
-              </w:rPr>
-              <w:t>generate(), exportPDF()</w:t>
+            <w:proofErr w:type="gramStart"/>
+            <w:r>
+              <w:rPr>
+                <w:sz w:val="20"/>
+                <w:szCs w:val="20"/>
+              </w:rPr>
+              <w:t>generate(</w:t>
+            </w:r>
+            <w:proofErr w:type="gramEnd"/>
+            <w:r>
+              <w:rPr>
+                <w:sz w:val="20"/>
+                <w:szCs w:val="20"/>
+              </w:rPr>
+              <w:t xml:space="preserve">), </w:t>
+            </w:r>
+            <w:proofErr w:type="spellStart"/>
+            <w:proofErr w:type="gramStart"/>
+            <w:r>
+              <w:rPr>
+                <w:sz w:val="20"/>
+                <w:szCs w:val="20"/>
+              </w:rPr>
+              <w:t>exportPDF</w:t>
+            </w:r>
+            <w:proofErr w:type="spellEnd"/>
+            <w:r>
+              <w:rPr>
+                <w:sz w:val="20"/>
+                <w:szCs w:val="20"/>
+              </w:rPr>
+              <w:t>(</w:t>
+            </w:r>
+            <w:proofErr w:type="gramEnd"/>
+            <w:r>
+              <w:rPr>
+                <w:sz w:val="20"/>
+                <w:szCs w:val="20"/>
+              </w:rPr>
+              <w:t>)</w:t>
             </w:r>
           </w:p>
         </w:tc>
@@ -1657,6 +3218,7 @@
               </w:rPr>
               <w:t xml:space="preserve"> по данным </w:t>
             </w:r>
+            <w:proofErr w:type="spellStart"/>
             <w:r>
               <w:rPr>
                 <w:sz w:val="20"/>
@@ -1664,6 +3226,7 @@
               </w:rPr>
               <w:t>SensorReading</w:t>
             </w:r>
+            <w:proofErr w:type="spellEnd"/>
             <w:r>
               <w:rPr>
                 <w:sz w:val="20"/>
@@ -1681,6 +3244,7 @@
             <w:tcW w:w="2000" w:type="dxa"/>
           </w:tcPr>
           <w:p>
+            <w:proofErr w:type="spellStart"/>
             <w:r>
               <w:rPr>
                 <w:sz w:val="20"/>
@@ -1688,6 +3252,7 @@
               </w:rPr>
               <w:t>ServiceTicket</w:t>
             </w:r>
+            <w:proofErr w:type="spellEnd"/>
           </w:p>
         </w:tc>
         <w:tc>
@@ -1700,8 +3265,65 @@
                 <w:sz w:val="20"/>
                 <w:szCs w:val="20"/>
               </w:rPr>
-              <w:t>id, deviceId, operatorId, description, status: TicketStatus, createdAt</w:t>
-            </w:r>
+              <w:t xml:space="preserve">id, </w:t>
+            </w:r>
+            <w:proofErr w:type="spellStart"/>
+            <w:r>
+              <w:rPr>
+                <w:sz w:val="20"/>
+                <w:szCs w:val="20"/>
+              </w:rPr>
+              <w:t>deviceId</w:t>
+            </w:r>
+            <w:proofErr w:type="spellEnd"/>
+            <w:r>
+              <w:rPr>
+                <w:sz w:val="20"/>
+                <w:szCs w:val="20"/>
+              </w:rPr>
+              <w:t xml:space="preserve">, </w:t>
+            </w:r>
+            <w:proofErr w:type="spellStart"/>
+            <w:r>
+              <w:rPr>
+                <w:sz w:val="20"/>
+                <w:szCs w:val="20"/>
+              </w:rPr>
+              <w:t>operatorId</w:t>
+            </w:r>
+            <w:proofErr w:type="spellEnd"/>
+            <w:r>
+              <w:rPr>
+                <w:sz w:val="20"/>
+                <w:szCs w:val="20"/>
+              </w:rPr>
+              <w:t xml:space="preserve">, description, status: </w:t>
+            </w:r>
+            <w:proofErr w:type="spellStart"/>
+            <w:r>
+              <w:rPr>
+                <w:sz w:val="20"/>
+                <w:szCs w:val="20"/>
+              </w:rPr>
+              <w:t>TicketStatus</w:t>
+            </w:r>
+            <w:proofErr w:type="spellEnd"/>
+            <w:r>
+              <w:rPr>
+                <w:sz w:val="20"/>
+                <w:szCs w:val="20"/>
+              </w:rPr>
+              <w:t xml:space="preserve">, </w:t>
+            </w:r>
+            <w:proofErr w:type="spellStart"/>
+            <w:r>
+              <w:rPr>
+                <w:sz w:val="20"/>
+                <w:szCs w:val="20"/>
+              </w:rPr>
+              <w:t>createdAt</w:t>
+            </w:r>
+            <w:proofErr w:type="spellEnd"/>
           </w:p>
         </w:tc>
         <w:tc>
@@ -1709,12 +3331,37 @@
             <w:tcW w:w="2060" w:type="dxa"/>
           </w:tcPr>
           <w:p>
-            <w:r>
-              <w:rPr>
-                <w:sz w:val="20"/>
-                <w:szCs w:val="20"/>
-              </w:rPr>
-              <w:t>create(), resolve()</w:t>
+            <w:proofErr w:type="gramStart"/>
+            <w:r>
+              <w:rPr>
+                <w:sz w:val="20"/>
+                <w:szCs w:val="20"/>
+              </w:rPr>
+              <w:t>create(</w:t>
+            </w:r>
+            <w:proofErr w:type="gramEnd"/>
+            <w:r>
+              <w:rPr>
+                <w:sz w:val="20"/>
+                <w:szCs w:val="20"/>
+              </w:rPr>
+              <w:t xml:space="preserve">), </w:t>
+            </w:r>
+            <w:proofErr w:type="gramStart"/>
+            <w:r>
+              <w:rPr>
+                <w:sz w:val="20"/>
+                <w:szCs w:val="20"/>
+              </w:rPr>
+              <w:t>resolve(</w:t>
+            </w:r>
+            <w:proofErr w:type="gramEnd"/>
+            <w:r>
+              <w:rPr>
+                <w:sz w:val="20"/>
+                <w:szCs w:val="20"/>
+              </w:rPr>
+              <w:t>)</w:t>
             </w:r>
           </w:p>
         </w:tc>
@@ -1723,12 +3370,69 @@
             <w:tcW w:w="2300" w:type="dxa"/>
           </w:tcPr>
           <w:p>
-            <w:r>
-              <w:rPr>
-                <w:sz w:val="20"/>
-                <w:szCs w:val="20"/>
-              </w:rPr>
-              <w:t>Создаётся Operator при неисправности SensorDevice.</w:t>
+            <w:proofErr w:type="spellStart"/>
+            <w:r>
+              <w:rPr>
+                <w:sz w:val="20"/>
+                <w:szCs w:val="20"/>
+              </w:rPr>
+              <w:t>Создаётся</w:t>
+            </w:r>
+            <w:proofErr w:type="spellEnd"/>
+            <w:r>
+              <w:rPr>
+                <w:sz w:val="20"/>
+                <w:szCs w:val="20"/>
+              </w:rPr>
+              <w:t xml:space="preserve"> Operator </w:t>
+            </w:r>
+            <w:proofErr w:type="spellStart"/>
+            <w:r>
+              <w:rPr>
+                <w:sz w:val="20"/>
+                <w:szCs w:val="20"/>
+              </w:rPr>
+              <w:t>при</w:t>
+            </w:r>
+            <w:proofErr w:type="spellEnd"/>
+            <w:r>
+              <w:rPr>
+                <w:sz w:val="20"/>
+                <w:szCs w:val="20"/>
+              </w:rPr>
+              <w:t xml:space="preserve"> </w:t>
+            </w:r>
+            <w:proofErr w:type="spellStart"/>
+            <w:r>
+              <w:rPr>
+                <w:sz w:val="20"/>
+                <w:szCs w:val="20"/>
+              </w:rPr>
+              <w:t>неисправности</w:t>
+            </w:r>
+            <w:proofErr w:type="spellEnd"/>
+            <w:r>
+              <w:rPr>
+                <w:sz w:val="20"/>
+                <w:szCs w:val="20"/>
+              </w:rPr>
+              <w:t xml:space="preserve"> </w:t>
+            </w:r>
+            <w:proofErr w:type="spellStart"/>
+            <w:r>
+              <w:rPr>
+                <w:sz w:val="20"/>
+                <w:szCs w:val="20"/>
+              </w:rPr>
+              <w:t>SensorDevice</w:t>
+            </w:r>
+            <w:proofErr w:type="spellEnd"/>
+            <w:r>
+              <w:rPr>
+                <w:sz w:val="20"/>
+                <w:szCs w:val="20"/>
+              </w:rPr>
+              <w:t>.</w:t>
             </w:r>
           </w:p>
         </w:tc>
@@ -1739,6 +3443,7 @@
             <w:tcW w:w="2000" w:type="dxa"/>
           </w:tcPr>
           <w:p>
+            <w:proofErr w:type="spellStart"/>
             <w:r>
               <w:rPr>
                 <w:sz w:val="20"/>
@@ -1746,6 +3451,7 @@
               </w:rPr>
               <w:t>AuditLog</w:t>
             </w:r>
+            <w:proofErr w:type="spellEnd"/>
           </w:p>
         </w:tc>
         <w:tc>
@@ -1758,8 +3464,33 @@
                 <w:sz w:val="20"/>
                 <w:szCs w:val="20"/>
               </w:rPr>
-              <w:t>id, userId, action, target, performedAt</w:t>
-            </w:r>
+              <w:t xml:space="preserve">id, </w:t>
+            </w:r>
+            <w:proofErr w:type="spellStart"/>
+            <w:r>
+              <w:rPr>
+                <w:sz w:val="20"/>
+                <w:szCs w:val="20"/>
+              </w:rPr>
+              <w:t>userId</w:t>
+            </w:r>
+            <w:proofErr w:type="spellEnd"/>
+            <w:r>
+              <w:rPr>
+                <w:sz w:val="20"/>
+                <w:szCs w:val="20"/>
+              </w:rPr>
+              <w:t xml:space="preserve">, action, target, </w:t>
+            </w:r>
+            <w:proofErr w:type="spellStart"/>
+            <w:r>
+              <w:rPr>
+                <w:sz w:val="20"/>
+                <w:szCs w:val="20"/>
+              </w:rPr>
+              <w:t>performedAt</w:t>
+            </w:r>
+            <w:proofErr w:type="spellEnd"/>
           </w:p>
         </w:tc>
         <w:tc>
@@ -1767,12 +3498,21 @@
             <w:tcW w:w="2060" w:type="dxa"/>
           </w:tcPr>
           <w:p>
-            <w:r>
-              <w:rPr>
-                <w:sz w:val="20"/>
-                <w:szCs w:val="20"/>
-              </w:rPr>
-              <w:t>record()</w:t>
+            <w:proofErr w:type="gramStart"/>
+            <w:r>
+              <w:rPr>
+                <w:sz w:val="20"/>
+                <w:szCs w:val="20"/>
+              </w:rPr>
+              <w:t>record(</w:t>
+            </w:r>
+            <w:proofErr w:type="gramEnd"/>
+            <w:r>
+              <w:rPr>
+                <w:sz w:val="20"/>
+                <w:szCs w:val="20"/>
+              </w:rPr>
+              <w:t>)</w:t>
             </w:r>
           </w:p>
         </w:tc>
@@ -1793,6 +3533,125 @@
                 <w:lang w:val="ru-RU"/>
               </w:rPr>
               <w:t>Фиксирует все критичные действия пользователей и системные события.</w:t>
+            </w:r>
+          </w:p>
+        </w:tc>
+      </w:tr>
+      <w:tr>
+        <w:tc>
+          <w:tcPr>
+            <w:tcW w:w="2000" w:type="dxa"/>
+          </w:tcPr>
+          <w:p>
+            <w:pPr>
+              <w:rPr>
+                <w:sz w:val="20"/>
+                <w:szCs w:val="20"/>
+              </w:rPr>
+            </w:pPr>
+            <w:r>
+              <w:rPr>
+                <w:sz w:val="20"/>
+                <w:szCs w:val="20"/>
+              </w:rPr>
+              <w:t>Manager</w:t>
+            </w:r>
+          </w:p>
+        </w:tc>
+        <w:tc>
+          <w:tcPr>
+            <w:tcW w:w="3000" w:type="dxa"/>
+          </w:tcPr>
+          <w:p>
+            <w:pPr>
+              <w:rPr>
+                <w:sz w:val="20"/>
+                <w:szCs w:val="20"/>
+              </w:rPr>
+            </w:pPr>
+          </w:p>
+        </w:tc>
+        <w:tc>
+          <w:tcPr>
+            <w:tcW w:w="2060" w:type="dxa"/>
+          </w:tcPr>
+          <w:p>
+            <w:pPr>
+              <w:rPr>
+                <w:sz w:val="20"/>
+                <w:szCs w:val="20"/>
+              </w:rPr>
+            </w:pPr>
+            <w:proofErr w:type="spellStart"/>
+            <w:proofErr w:type="gramStart"/>
+            <w:r>
+              <w:rPr>
+                <w:sz w:val="20"/>
+                <w:szCs w:val="20"/>
+              </w:rPr>
+              <w:t>viewSummary</w:t>
+            </w:r>
+            <w:proofErr w:type="spellEnd"/>
+            <w:r>
+              <w:rPr>
+                <w:sz w:val="20"/>
+                <w:szCs w:val="20"/>
+              </w:rPr>
+              <w:t>(</w:t>
+            </w:r>
+            <w:proofErr w:type="gramEnd"/>
+            <w:r>
+              <w:rPr>
+                <w:sz w:val="20"/>
+                <w:szCs w:val="20"/>
+              </w:rPr>
+              <w:t>)</w:t>
+            </w:r>
+          </w:p>
+        </w:tc>
+        <w:tc>
+          <w:tcPr>
+            <w:tcW w:w="2300" w:type="dxa"/>
+          </w:tcPr>
+          <w:p>
+            <w:pPr>
+              <w:rPr>
+                <w:sz w:val="20"/>
+                <w:szCs w:val="20"/>
+                <w:lang w:val="ru-RU"/>
+              </w:rPr>
+            </w:pPr>
+            <w:proofErr w:type="spellStart"/>
+            <w:r>
+              <w:rPr>
+                <w:sz w:val="20"/>
+                <w:szCs w:val="20"/>
+              </w:rPr>
+              <w:t>наследуется</w:t>
+            </w:r>
+            <w:proofErr w:type="spellEnd"/>
+            <w:r>
+              <w:rPr>
+                <w:sz w:val="20"/>
+                <w:szCs w:val="20"/>
+              </w:rPr>
+              <w:t xml:space="preserve"> </w:t>
+            </w:r>
+            <w:proofErr w:type="spellStart"/>
+            <w:r>
+              <w:rPr>
+                <w:sz w:val="20"/>
+                <w:szCs w:val="20"/>
+              </w:rPr>
+              <w:t>от</w:t>
+            </w:r>
+            <w:proofErr w:type="spellEnd"/>
+            <w:r>
+              <w:rPr>
+                <w:sz w:val="20"/>
+                <w:szCs w:val="20"/>
+              </w:rPr>
+              <w:t xml:space="preserve"> User</w:t>
             </w:r>
           </w:p>
         </w:tc>
@@ -1829,36 +3688,44 @@
         </w:rPr>
         <w:t xml:space="preserve"> содержит несколько </w:t>
       </w:r>
+      <w:proofErr w:type="spellStart"/>
       <w:r>
         <w:t>SensorDevice</w:t>
       </w:r>
+      <w:proofErr w:type="spellEnd"/>
       <w:r>
         <w:rPr>
           <w:lang w:val="ru-RU"/>
         </w:rPr>
         <w:t xml:space="preserve">; </w:t>
       </w:r>
+      <w:proofErr w:type="spellStart"/>
       <w:r>
         <w:t>SensorDevice</w:t>
       </w:r>
+      <w:proofErr w:type="spellEnd"/>
       <w:r>
         <w:rPr>
           <w:lang w:val="ru-RU"/>
         </w:rPr>
         <w:t xml:space="preserve"> создаёт </w:t>
       </w:r>
+      <w:proofErr w:type="spellStart"/>
       <w:r>
         <w:t>SensorReading</w:t>
       </w:r>
+      <w:proofErr w:type="spellEnd"/>
       <w:r>
         <w:rPr>
           <w:lang w:val="ru-RU"/>
         </w:rPr>
         <w:t xml:space="preserve">; </w:t>
       </w:r>
+      <w:proofErr w:type="spellStart"/>
       <w:r>
         <w:t>SensorReading</w:t>
       </w:r>
+      <w:proofErr w:type="spellEnd"/>
       <w:r>
         <w:rPr>
           <w:lang w:val="ru-RU"/>
@@ -1892,9 +3759,11 @@
         </w:rPr>
         <w:t xml:space="preserve"> и закрывается через </w:t>
       </w:r>
+      <w:proofErr w:type="spellStart"/>
       <w:r>
         <w:t>IncidentReport</w:t>
       </w:r>
+      <w:proofErr w:type="spellEnd"/>
       <w:r>
         <w:rPr>
           <w:lang w:val="ru-RU"/>
@@ -1919,9 +3788,11 @@
         </w:rPr>
         <w:t xml:space="preserve"> и составляет </w:t>
       </w:r>
+      <w:proofErr w:type="spellStart"/>
       <w:r>
         <w:t>IncidentReport</w:t>
       </w:r>
+      <w:proofErr w:type="spellEnd"/>
       <w:r>
         <w:rPr>
           <w:lang w:val="ru-RU"/>
@@ -1946,9 +3817,11 @@
         </w:rPr>
         <w:t xml:space="preserve"> на основе </w:t>
       </w:r>
+      <w:proofErr w:type="spellStart"/>
       <w:r>
         <w:t>SensorReading</w:t>
       </w:r>
+      <w:proofErr w:type="spellEnd"/>
       <w:r>
         <w:rPr>
           <w:lang w:val="ru-RU"/>
@@ -1964,18 +3837,22 @@
         </w:rPr>
         <w:t xml:space="preserve"> создаёт </w:t>
       </w:r>
+      <w:proofErr w:type="spellStart"/>
       <w:r>
         <w:t>ServiceTicket</w:t>
       </w:r>
+      <w:proofErr w:type="spellEnd"/>
       <w:r>
         <w:rPr>
           <w:lang w:val="ru-RU"/>
         </w:rPr>
         <w:t xml:space="preserve"> для неисправного </w:t>
       </w:r>
+      <w:proofErr w:type="spellStart"/>
       <w:r>
         <w:t>SensorDevice</w:t>
       </w:r>
+      <w:proofErr w:type="spellEnd"/>
       <w:r>
         <w:rPr>
           <w:lang w:val="ru-RU"/>
@@ -1991,9 +3868,11 @@
         </w:rPr>
         <w:t xml:space="preserve"> управляет </w:t>
       </w:r>
+      <w:proofErr w:type="spellStart"/>
       <w:r>
         <w:t>SensorDevice</w:t>
       </w:r>
+      <w:proofErr w:type="spellEnd"/>
       <w:r>
         <w:rPr>
           <w:lang w:val="ru-RU"/>
@@ -2237,6 +4116,7 @@
             <w:tcW w:w="2400" w:type="dxa"/>
           </w:tcPr>
           <w:p>
+            <w:proofErr w:type="spellStart"/>
             <w:r>
               <w:rPr>
                 <w:b/>
@@ -2246,6 +4126,7 @@
               </w:rPr>
               <w:t>Участник</w:t>
             </w:r>
+            <w:proofErr w:type="spellEnd"/>
           </w:p>
         </w:tc>
         <w:tc>
@@ -2253,6 +4134,7 @@
             <w:tcW w:w="6360" w:type="dxa"/>
           </w:tcPr>
           <w:p>
+            <w:proofErr w:type="spellStart"/>
             <w:r>
               <w:rPr>
                 <w:b/>
@@ -2262,6 +4144,7 @@
               </w:rPr>
               <w:t>Действие</w:t>
             </w:r>
+            <w:proofErr w:type="spellEnd"/>
           </w:p>
         </w:tc>
       </w:tr>
@@ -2285,12 +4168,21 @@
             <w:tcW w:w="2400" w:type="dxa"/>
           </w:tcPr>
           <w:p>
-            <w:r>
-              <w:rPr>
-                <w:sz w:val="21"/>
-                <w:szCs w:val="21"/>
-              </w:rPr>
-              <w:t>Устройство Arduino</w:t>
+            <w:proofErr w:type="spellStart"/>
+            <w:r>
+              <w:rPr>
+                <w:sz w:val="21"/>
+                <w:szCs w:val="21"/>
+              </w:rPr>
+              <w:t>Устройство</w:t>
+            </w:r>
+            <w:proofErr w:type="spellEnd"/>
+            <w:r>
+              <w:rPr>
+                <w:sz w:val="21"/>
+                <w:szCs w:val="21"/>
+              </w:rPr>
+              <w:t xml:space="preserve"> Arduino</w:t>
             </w:r>
           </w:p>
         </w:tc>
@@ -2445,13 +4337,31 @@
             <w:tcW w:w="2400" w:type="dxa"/>
           </w:tcPr>
           <w:p>
-            <w:r>
-              <w:rPr>
-                <w:sz w:val="21"/>
-                <w:szCs w:val="21"/>
-              </w:rPr>
-              <w:t>Модуль мониторинга</w:t>
-            </w:r>
+            <w:proofErr w:type="spellStart"/>
+            <w:r>
+              <w:rPr>
+                <w:sz w:val="21"/>
+                <w:szCs w:val="21"/>
+              </w:rPr>
+              <w:t>Модуль</w:t>
+            </w:r>
+            <w:proofErr w:type="spellEnd"/>
+            <w:r>
+              <w:rPr>
+                <w:sz w:val="21"/>
+                <w:szCs w:val="21"/>
+              </w:rPr>
+              <w:t xml:space="preserve"> </w:t>
+            </w:r>
+            <w:proofErr w:type="spellStart"/>
+            <w:r>
+              <w:rPr>
+                <w:sz w:val="21"/>
+                <w:szCs w:val="21"/>
+              </w:rPr>
+              <w:t>мониторинга</w:t>
+            </w:r>
+            <w:proofErr w:type="spellEnd"/>
           </w:p>
         </w:tc>
         <w:tc>
@@ -2495,13 +4405,31 @@
             <w:tcW w:w="2400" w:type="dxa"/>
           </w:tcPr>
           <w:p>
-            <w:r>
-              <w:rPr>
-                <w:sz w:val="21"/>
-                <w:szCs w:val="21"/>
-              </w:rPr>
-              <w:t>База данных</w:t>
-            </w:r>
+            <w:proofErr w:type="spellStart"/>
+            <w:r>
+              <w:rPr>
+                <w:sz w:val="21"/>
+                <w:szCs w:val="21"/>
+              </w:rPr>
+              <w:t>База</w:t>
+            </w:r>
+            <w:proofErr w:type="spellEnd"/>
+            <w:r>
+              <w:rPr>
+                <w:sz w:val="21"/>
+                <w:szCs w:val="21"/>
+              </w:rPr>
+              <w:t xml:space="preserve"> </w:t>
+            </w:r>
+            <w:proofErr w:type="spellStart"/>
+            <w:r>
+              <w:rPr>
+                <w:sz w:val="21"/>
+                <w:szCs w:val="21"/>
+              </w:rPr>
+              <w:t>данных</w:t>
+            </w:r>
+            <w:proofErr w:type="spellEnd"/>
           </w:p>
         </w:tc>
         <w:tc>
@@ -2560,13 +4488,31 @@
             <w:tcW w:w="2400" w:type="dxa"/>
           </w:tcPr>
           <w:p>
-            <w:r>
-              <w:rPr>
-                <w:sz w:val="21"/>
-                <w:szCs w:val="21"/>
-              </w:rPr>
-              <w:t>Модуль мониторинга</w:t>
-            </w:r>
+            <w:proofErr w:type="spellStart"/>
+            <w:r>
+              <w:rPr>
+                <w:sz w:val="21"/>
+                <w:szCs w:val="21"/>
+              </w:rPr>
+              <w:t>Модуль</w:t>
+            </w:r>
+            <w:proofErr w:type="spellEnd"/>
+            <w:r>
+              <w:rPr>
+                <w:sz w:val="21"/>
+                <w:szCs w:val="21"/>
+              </w:rPr>
+              <w:t xml:space="preserve"> </w:t>
+            </w:r>
+            <w:proofErr w:type="spellStart"/>
+            <w:r>
+              <w:rPr>
+                <w:sz w:val="21"/>
+                <w:szCs w:val="21"/>
+              </w:rPr>
+              <w:t>мониторинга</w:t>
+            </w:r>
+            <w:proofErr w:type="spellEnd"/>
           </w:p>
         </w:tc>
         <w:tc>
@@ -2610,13 +4556,31 @@
             <w:tcW w:w="2400" w:type="dxa"/>
           </w:tcPr>
           <w:p>
-            <w:r>
-              <w:rPr>
-                <w:sz w:val="21"/>
-                <w:szCs w:val="21"/>
-              </w:rPr>
-              <w:t>Модуль уведомлений</w:t>
-            </w:r>
+            <w:proofErr w:type="spellStart"/>
+            <w:r>
+              <w:rPr>
+                <w:sz w:val="21"/>
+                <w:szCs w:val="21"/>
+              </w:rPr>
+              <w:t>Модуль</w:t>
+            </w:r>
+            <w:proofErr w:type="spellEnd"/>
+            <w:r>
+              <w:rPr>
+                <w:sz w:val="21"/>
+                <w:szCs w:val="21"/>
+              </w:rPr>
+              <w:t xml:space="preserve"> </w:t>
+            </w:r>
+            <w:proofErr w:type="spellStart"/>
+            <w:r>
+              <w:rPr>
+                <w:sz w:val="21"/>
+                <w:szCs w:val="21"/>
+              </w:rPr>
+              <w:t>уведомлений</w:t>
+            </w:r>
+            <w:proofErr w:type="spellEnd"/>
           </w:p>
         </w:tc>
         <w:tc>
@@ -2756,8 +4720,17 @@
                 <w:sz w:val="21"/>
                 <w:szCs w:val="21"/>
               </w:rPr>
-              <w:t>iOS-приложение</w:t>
-            </w:r>
+              <w:t>iOS-</w:t>
+            </w:r>
+            <w:proofErr w:type="spellStart"/>
+            <w:r>
+              <w:rPr>
+                <w:sz w:val="21"/>
+                <w:szCs w:val="21"/>
+              </w:rPr>
+              <w:t>приложение</w:t>
+            </w:r>
+            <w:proofErr w:type="spellEnd"/>
           </w:p>
         </w:tc>
         <w:tc>
@@ -2831,6 +4804,7 @@
             <w:tcW w:w="2400" w:type="dxa"/>
           </w:tcPr>
           <w:p>
+            <w:proofErr w:type="spellStart"/>
             <w:r>
               <w:rPr>
                 <w:sz w:val="21"/>
@@ -2838,6 +4812,7 @@
               </w:rPr>
               <w:t>Инспектор</w:t>
             </w:r>
+            <w:proofErr w:type="spellEnd"/>
           </w:p>
         </w:tc>
         <w:tc>
@@ -2886,8 +4861,17 @@
                 <w:sz w:val="21"/>
                 <w:szCs w:val="21"/>
               </w:rPr>
-              <w:t>iOS-приложение</w:t>
-            </w:r>
+              <w:t>iOS-</w:t>
+            </w:r>
+            <w:proofErr w:type="spellStart"/>
+            <w:r>
+              <w:rPr>
+                <w:sz w:val="21"/>
+                <w:szCs w:val="21"/>
+              </w:rPr>
+              <w:t>приложение</w:t>
+            </w:r>
+            <w:proofErr w:type="spellEnd"/>
           </w:p>
         </w:tc>
         <w:tc>
@@ -3026,6 +5010,7 @@
             <w:tcW w:w="2400" w:type="dxa"/>
           </w:tcPr>
           <w:p>
+            <w:proofErr w:type="spellStart"/>
             <w:r>
               <w:rPr>
                 <w:sz w:val="21"/>
@@ -3033,6 +5018,7 @@
               </w:rPr>
               <w:t>Инспектор</w:t>
             </w:r>
+            <w:proofErr w:type="spellEnd"/>
           </w:p>
         </w:tc>
         <w:tc>
@@ -3126,6 +5112,7 @@
             <w:tcW w:w="2400" w:type="dxa"/>
           </w:tcPr>
           <w:p>
+            <w:proofErr w:type="spellStart"/>
             <w:r>
               <w:rPr>
                 <w:sz w:val="21"/>
@@ -3133,6 +5120,7 @@
               </w:rPr>
               <w:t>Инспектор</w:t>
             </w:r>
+            <w:proofErr w:type="spellEnd"/>
           </w:p>
         </w:tc>
         <w:tc>
@@ -3181,8 +5169,17 @@
                 <w:sz w:val="21"/>
                 <w:szCs w:val="21"/>
               </w:rPr>
-              <w:t>iOS-приложение</w:t>
-            </w:r>
+              <w:t>iOS-</w:t>
+            </w:r>
+            <w:proofErr w:type="spellStart"/>
+            <w:r>
+              <w:rPr>
+                <w:sz w:val="21"/>
+                <w:szCs w:val="21"/>
+              </w:rPr>
+              <w:t>приложение</w:t>
+            </w:r>
+            <w:proofErr w:type="spellEnd"/>
           </w:p>
         </w:tc>
         <w:tc>
@@ -3386,8 +5383,17 @@
                 <w:sz w:val="21"/>
                 <w:szCs w:val="21"/>
               </w:rPr>
-              <w:t>iOS-приложение</w:t>
-            </w:r>
+              <w:t>iOS-</w:t>
+            </w:r>
+            <w:proofErr w:type="spellStart"/>
+            <w:r>
+              <w:rPr>
+                <w:sz w:val="21"/>
+                <w:szCs w:val="21"/>
+              </w:rPr>
+              <w:t>приложение</w:t>
+            </w:r>
+            <w:proofErr w:type="spellEnd"/>
           </w:p>
         </w:tc>
         <w:tc>
@@ -3659,6 +5665,7 @@
             <w:tcW w:w="1700" w:type="dxa"/>
           </w:tcPr>
           <w:p>
+            <w:proofErr w:type="spellStart"/>
             <w:r>
               <w:rPr>
                 <w:b/>
@@ -3666,15 +5673,9 @@
                 <w:sz w:val="19"/>
                 <w:szCs w:val="19"/>
               </w:rPr>
-              <w:t>Что проверяется</w:t>
-            </w:r>
-          </w:p>
-        </w:tc>
-        <w:tc>
-          <w:tcPr>
-            <w:tcW w:w="1760" w:type="dxa"/>
-          </w:tcPr>
-          <w:p>
+              <w:t>Что</w:t>
+            </w:r>
+            <w:proofErr w:type="spellEnd"/>
             <w:r>
               <w:rPr>
                 <w:b/>
@@ -3682,15 +5683,9 @@
                 <w:sz w:val="19"/>
                 <w:szCs w:val="19"/>
               </w:rPr>
-              <w:t>Входные данные</w:t>
-            </w:r>
-          </w:p>
-        </w:tc>
-        <w:tc>
-          <w:tcPr>
-            <w:tcW w:w="2200" w:type="dxa"/>
-          </w:tcPr>
-          <w:p>
+              <w:t xml:space="preserve"> </w:t>
+            </w:r>
+            <w:proofErr w:type="spellStart"/>
             <w:r>
               <w:rPr>
                 <w:b/>
@@ -3698,15 +5693,17 @@
                 <w:sz w:val="19"/>
                 <w:szCs w:val="19"/>
               </w:rPr>
-              <w:t>Действия пользователя</w:t>
-            </w:r>
-          </w:p>
-        </w:tc>
-        <w:tc>
-          <w:tcPr>
-            <w:tcW w:w="3300" w:type="dxa"/>
-          </w:tcPr>
-          <w:p>
+              <w:t>проверяется</w:t>
+            </w:r>
+            <w:proofErr w:type="spellEnd"/>
+          </w:p>
+        </w:tc>
+        <w:tc>
+          <w:tcPr>
+            <w:tcW w:w="1760" w:type="dxa"/>
+          </w:tcPr>
+          <w:p>
+            <w:proofErr w:type="spellStart"/>
             <w:r>
               <w:rPr>
                 <w:b/>
@@ -3714,8 +5711,105 @@
                 <w:sz w:val="19"/>
                 <w:szCs w:val="19"/>
               </w:rPr>
-              <w:t>Ожидаемый результат</w:t>
-            </w:r>
+              <w:t>Входные</w:t>
+            </w:r>
+            <w:proofErr w:type="spellEnd"/>
+            <w:r>
+              <w:rPr>
+                <w:b/>
+                <w:bCs/>
+                <w:sz w:val="19"/>
+                <w:szCs w:val="19"/>
+              </w:rPr>
+              <w:t xml:space="preserve"> </w:t>
+            </w:r>
+            <w:proofErr w:type="spellStart"/>
+            <w:r>
+              <w:rPr>
+                <w:b/>
+                <w:bCs/>
+                <w:sz w:val="19"/>
+                <w:szCs w:val="19"/>
+              </w:rPr>
+              <w:t>данные</w:t>
+            </w:r>
+            <w:proofErr w:type="spellEnd"/>
+          </w:p>
+        </w:tc>
+        <w:tc>
+          <w:tcPr>
+            <w:tcW w:w="2200" w:type="dxa"/>
+          </w:tcPr>
+          <w:p>
+            <w:proofErr w:type="spellStart"/>
+            <w:r>
+              <w:rPr>
+                <w:b/>
+                <w:bCs/>
+                <w:sz w:val="19"/>
+                <w:szCs w:val="19"/>
+              </w:rPr>
+              <w:t>Действия</w:t>
+            </w:r>
+            <w:proofErr w:type="spellEnd"/>
+            <w:r>
+              <w:rPr>
+                <w:b/>
+                <w:bCs/>
+                <w:sz w:val="19"/>
+                <w:szCs w:val="19"/>
+              </w:rPr>
+              <w:t xml:space="preserve"> </w:t>
+            </w:r>
+            <w:proofErr w:type="spellStart"/>
+            <w:r>
+              <w:rPr>
+                <w:b/>
+                <w:bCs/>
+                <w:sz w:val="19"/>
+                <w:szCs w:val="19"/>
+              </w:rPr>
+              <w:t>пользователя</w:t>
+            </w:r>
+            <w:proofErr w:type="spellEnd"/>
+          </w:p>
+        </w:tc>
+        <w:tc>
+          <w:tcPr>
+            <w:tcW w:w="3300" w:type="dxa"/>
+          </w:tcPr>
+          <w:p>
+            <w:proofErr w:type="spellStart"/>
+            <w:r>
+              <w:rPr>
+                <w:b/>
+                <w:bCs/>
+                <w:sz w:val="19"/>
+                <w:szCs w:val="19"/>
+              </w:rPr>
+              <w:t>Ожидаемый</w:t>
+            </w:r>
+            <w:proofErr w:type="spellEnd"/>
+            <w:r>
+              <w:rPr>
+                <w:b/>
+                <w:bCs/>
+                <w:sz w:val="19"/>
+                <w:szCs w:val="19"/>
+              </w:rPr>
+              <w:t xml:space="preserve"> </w:t>
+            </w:r>
+            <w:proofErr w:type="spellStart"/>
+            <w:r>
+              <w:rPr>
+                <w:b/>
+                <w:bCs/>
+                <w:sz w:val="19"/>
+                <w:szCs w:val="19"/>
+              </w:rPr>
+              <w:t>результат</w:t>
+            </w:r>
+            <w:proofErr w:type="spellEnd"/>
           </w:p>
         </w:tc>
       </w:tr>
@@ -3902,6 +5996,7 @@
               </w:rPr>
               <w:t xml:space="preserve">Сервер принимает пакет, сохраняет </w:t>
             </w:r>
+            <w:proofErr w:type="spellStart"/>
             <w:r>
               <w:rPr>
                 <w:sz w:val="19"/>
@@ -3909,6 +6004,7 @@
               </w:rPr>
               <w:t>SensorReading</w:t>
             </w:r>
+            <w:proofErr w:type="spellEnd"/>
             <w:r>
               <w:rPr>
                 <w:sz w:val="19"/>
@@ -4111,13 +6207,47 @@
             <w:tcW w:w="1700" w:type="dxa"/>
           </w:tcPr>
           <w:p>
-            <w:r>
-              <w:rPr>
-                <w:sz w:val="19"/>
-                <w:szCs w:val="19"/>
-              </w:rPr>
-              <w:t>Доставка push-уведомления инспектору</w:t>
-            </w:r>
+            <w:proofErr w:type="spellStart"/>
+            <w:r>
+              <w:rPr>
+                <w:sz w:val="19"/>
+                <w:szCs w:val="19"/>
+              </w:rPr>
+              <w:t>Доставка</w:t>
+            </w:r>
+            <w:proofErr w:type="spellEnd"/>
+            <w:r>
+              <w:rPr>
+                <w:sz w:val="19"/>
+                <w:szCs w:val="19"/>
+              </w:rPr>
+              <w:t xml:space="preserve"> push-</w:t>
+            </w:r>
+            <w:proofErr w:type="spellStart"/>
+            <w:r>
+              <w:rPr>
+                <w:sz w:val="19"/>
+                <w:szCs w:val="19"/>
+              </w:rPr>
+              <w:t>уведомления</w:t>
+            </w:r>
+            <w:proofErr w:type="spellEnd"/>
+            <w:r>
+              <w:rPr>
+                <w:sz w:val="19"/>
+                <w:szCs w:val="19"/>
+              </w:rPr>
+              <w:t xml:space="preserve"> </w:t>
+            </w:r>
+            <w:proofErr w:type="spellStart"/>
+            <w:r>
+              <w:rPr>
+                <w:sz w:val="19"/>
+                <w:szCs w:val="19"/>
+              </w:rPr>
+              <w:t>инспектору</w:t>
+            </w:r>
+            <w:proofErr w:type="spellEnd"/>
           </w:p>
         </w:tc>
         <w:tc>
@@ -4364,13 +6494,47 @@
             <w:tcW w:w="1700" w:type="dxa"/>
           </w:tcPr>
           <w:p>
-            <w:r>
-              <w:rPr>
-                <w:sz w:val="19"/>
-                <w:szCs w:val="19"/>
-              </w:rPr>
-              <w:t>Фиксация выезда инспектором</w:t>
-            </w:r>
+            <w:proofErr w:type="spellStart"/>
+            <w:r>
+              <w:rPr>
+                <w:sz w:val="19"/>
+                <w:szCs w:val="19"/>
+              </w:rPr>
+              <w:t>Фиксация</w:t>
+            </w:r>
+            <w:proofErr w:type="spellEnd"/>
+            <w:r>
+              <w:rPr>
+                <w:sz w:val="19"/>
+                <w:szCs w:val="19"/>
+              </w:rPr>
+              <w:t xml:space="preserve"> </w:t>
+            </w:r>
+            <w:proofErr w:type="spellStart"/>
+            <w:r>
+              <w:rPr>
+                <w:sz w:val="19"/>
+                <w:szCs w:val="19"/>
+              </w:rPr>
+              <w:t>выезда</w:t>
+            </w:r>
+            <w:proofErr w:type="spellEnd"/>
+            <w:r>
+              <w:rPr>
+                <w:sz w:val="19"/>
+                <w:szCs w:val="19"/>
+              </w:rPr>
+              <w:t xml:space="preserve"> </w:t>
+            </w:r>
+            <w:proofErr w:type="spellStart"/>
+            <w:r>
+              <w:rPr>
+                <w:sz w:val="19"/>
+                <w:szCs w:val="19"/>
+              </w:rPr>
+              <w:t>инспектором</w:t>
+            </w:r>
+            <w:proofErr w:type="spellEnd"/>
           </w:p>
         </w:tc>
         <w:tc>
@@ -4378,13 +6542,63 @@
             <w:tcW w:w="1760" w:type="dxa"/>
           </w:tcPr>
           <w:p>
-            <w:r>
-              <w:rPr>
-                <w:sz w:val="19"/>
-                <w:szCs w:val="19"/>
-              </w:rPr>
-              <w:t>Инспектор авторизован, тревога открыта</w:t>
-            </w:r>
+            <w:proofErr w:type="spellStart"/>
+            <w:r>
+              <w:rPr>
+                <w:sz w:val="19"/>
+                <w:szCs w:val="19"/>
+              </w:rPr>
+              <w:t>Инспектор</w:t>
+            </w:r>
+            <w:proofErr w:type="spellEnd"/>
+            <w:r>
+              <w:rPr>
+                <w:sz w:val="19"/>
+                <w:szCs w:val="19"/>
+              </w:rPr>
+              <w:t xml:space="preserve"> </w:t>
+            </w:r>
+            <w:proofErr w:type="spellStart"/>
+            <w:r>
+              <w:rPr>
+                <w:sz w:val="19"/>
+                <w:szCs w:val="19"/>
+              </w:rPr>
+              <w:t>авторизован</w:t>
+            </w:r>
+            <w:proofErr w:type="spellEnd"/>
+            <w:r>
+              <w:rPr>
+                <w:sz w:val="19"/>
+                <w:szCs w:val="19"/>
+              </w:rPr>
+              <w:t xml:space="preserve">, </w:t>
+            </w:r>
+            <w:proofErr w:type="spellStart"/>
+            <w:r>
+              <w:rPr>
+                <w:sz w:val="19"/>
+                <w:szCs w:val="19"/>
+              </w:rPr>
+              <w:t>тревога</w:t>
+            </w:r>
+            <w:proofErr w:type="spellEnd"/>
+            <w:r>
+              <w:rPr>
+                <w:sz w:val="19"/>
+                <w:szCs w:val="19"/>
+              </w:rPr>
+              <w:t xml:space="preserve"> </w:t>
+            </w:r>
+            <w:proofErr w:type="spellStart"/>
+            <w:r>
+              <w:rPr>
+                <w:sz w:val="19"/>
+                <w:szCs w:val="19"/>
+              </w:rPr>
+              <w:t>открыта</w:t>
+            </w:r>
+            <w:proofErr w:type="spellEnd"/>
           </w:p>
         </w:tc>
         <w:tc>
@@ -4448,13 +6662,47 @@
             <w:tcW w:w="1700" w:type="dxa"/>
           </w:tcPr>
           <w:p>
-            <w:r>
-              <w:rPr>
-                <w:sz w:val="19"/>
-                <w:szCs w:val="19"/>
-              </w:rPr>
-              <w:t>Закрытие тревоги с результатом</w:t>
-            </w:r>
+            <w:proofErr w:type="spellStart"/>
+            <w:r>
+              <w:rPr>
+                <w:sz w:val="19"/>
+                <w:szCs w:val="19"/>
+              </w:rPr>
+              <w:t>Закрытие</w:t>
+            </w:r>
+            <w:proofErr w:type="spellEnd"/>
+            <w:r>
+              <w:rPr>
+                <w:sz w:val="19"/>
+                <w:szCs w:val="19"/>
+              </w:rPr>
+              <w:t xml:space="preserve"> </w:t>
+            </w:r>
+            <w:proofErr w:type="spellStart"/>
+            <w:r>
+              <w:rPr>
+                <w:sz w:val="19"/>
+                <w:szCs w:val="19"/>
+              </w:rPr>
+              <w:t>тревоги</w:t>
+            </w:r>
+            <w:proofErr w:type="spellEnd"/>
+            <w:r>
+              <w:rPr>
+                <w:sz w:val="19"/>
+                <w:szCs w:val="19"/>
+              </w:rPr>
+              <w:t xml:space="preserve"> с </w:t>
+            </w:r>
+            <w:proofErr w:type="spellStart"/>
+            <w:r>
+              <w:rPr>
+                <w:sz w:val="19"/>
+                <w:szCs w:val="19"/>
+              </w:rPr>
+              <w:t>результатом</w:t>
+            </w:r>
+            <w:proofErr w:type="spellEnd"/>
           </w:p>
         </w:tc>
         <w:tc>
@@ -4692,6 +6940,7 @@
                 <w:lang w:val="ru-RU"/>
               </w:rPr>
             </w:pPr>
+            <w:proofErr w:type="spellStart"/>
             <w:r>
               <w:rPr>
                 <w:sz w:val="19"/>
@@ -4699,6 +6948,7 @@
               </w:rPr>
               <w:t>SensorReading</w:t>
             </w:r>
+            <w:proofErr w:type="spellEnd"/>
             <w:r>
               <w:rPr>
                 <w:sz w:val="19"/>
@@ -4800,13 +7050,63 @@
             <w:tcW w:w="2200" w:type="dxa"/>
           </w:tcPr>
           <w:p>
-            <w:r>
-              <w:rPr>
-                <w:sz w:val="19"/>
-                <w:szCs w:val="19"/>
-              </w:rPr>
-              <w:t>Восстановить сетевое соединение устройства</w:t>
-            </w:r>
+            <w:proofErr w:type="spellStart"/>
+            <w:r>
+              <w:rPr>
+                <w:sz w:val="19"/>
+                <w:szCs w:val="19"/>
+              </w:rPr>
+              <w:t>Восстановить</w:t>
+            </w:r>
+            <w:proofErr w:type="spellEnd"/>
+            <w:r>
+              <w:rPr>
+                <w:sz w:val="19"/>
+                <w:szCs w:val="19"/>
+              </w:rPr>
+              <w:t xml:space="preserve"> </w:t>
+            </w:r>
+            <w:proofErr w:type="spellStart"/>
+            <w:r>
+              <w:rPr>
+                <w:sz w:val="19"/>
+                <w:szCs w:val="19"/>
+              </w:rPr>
+              <w:t>сетевое</w:t>
+            </w:r>
+            <w:proofErr w:type="spellEnd"/>
+            <w:r>
+              <w:rPr>
+                <w:sz w:val="19"/>
+                <w:szCs w:val="19"/>
+              </w:rPr>
+              <w:t xml:space="preserve"> </w:t>
+            </w:r>
+            <w:proofErr w:type="spellStart"/>
+            <w:r>
+              <w:rPr>
+                <w:sz w:val="19"/>
+                <w:szCs w:val="19"/>
+              </w:rPr>
+              <w:t>соединение</w:t>
+            </w:r>
+            <w:proofErr w:type="spellEnd"/>
+            <w:r>
+              <w:rPr>
+                <w:sz w:val="19"/>
+                <w:szCs w:val="19"/>
+              </w:rPr>
+              <w:t xml:space="preserve"> </w:t>
+            </w:r>
+            <w:proofErr w:type="spellStart"/>
+            <w:r>
+              <w:rPr>
+                <w:sz w:val="19"/>
+                <w:szCs w:val="19"/>
+              </w:rPr>
+              <w:t>устройства</w:t>
+            </w:r>
+            <w:proofErr w:type="spellEnd"/>
           </w:p>
         </w:tc>
         <w:tc>
@@ -4850,13 +7150,63 @@
             <w:tcW w:w="1700" w:type="dxa"/>
           </w:tcPr>
           <w:p>
-            <w:r>
-              <w:rPr>
-                <w:sz w:val="19"/>
-                <w:szCs w:val="19"/>
-              </w:rPr>
-              <w:t>Запрос аналитического отчёта экологом</w:t>
-            </w:r>
+            <w:proofErr w:type="spellStart"/>
+            <w:r>
+              <w:rPr>
+                <w:sz w:val="19"/>
+                <w:szCs w:val="19"/>
+              </w:rPr>
+              <w:t>Запрос</w:t>
+            </w:r>
+            <w:proofErr w:type="spellEnd"/>
+            <w:r>
+              <w:rPr>
+                <w:sz w:val="19"/>
+                <w:szCs w:val="19"/>
+              </w:rPr>
+              <w:t xml:space="preserve"> </w:t>
+            </w:r>
+            <w:proofErr w:type="spellStart"/>
+            <w:r>
+              <w:rPr>
+                <w:sz w:val="19"/>
+                <w:szCs w:val="19"/>
+              </w:rPr>
+              <w:t>аналитического</w:t>
+            </w:r>
+            <w:proofErr w:type="spellEnd"/>
+            <w:r>
+              <w:rPr>
+                <w:sz w:val="19"/>
+                <w:szCs w:val="19"/>
+              </w:rPr>
+              <w:t xml:space="preserve"> </w:t>
+            </w:r>
+            <w:proofErr w:type="spellStart"/>
+            <w:r>
+              <w:rPr>
+                <w:sz w:val="19"/>
+                <w:szCs w:val="19"/>
+              </w:rPr>
+              <w:t>отчёта</w:t>
+            </w:r>
+            <w:proofErr w:type="spellEnd"/>
+            <w:r>
+              <w:rPr>
+                <w:sz w:val="19"/>
+                <w:szCs w:val="19"/>
+              </w:rPr>
+              <w:t xml:space="preserve"> </w:t>
+            </w:r>
+            <w:proofErr w:type="spellStart"/>
+            <w:r>
+              <w:rPr>
+                <w:sz w:val="19"/>
+                <w:szCs w:val="19"/>
+              </w:rPr>
+              <w:t>экологом</w:t>
+            </w:r>
+            <w:proofErr w:type="spellEnd"/>
           </w:p>
         </w:tc>
         <w:tc>
@@ -5058,13 +7408,63 @@
             <w:tcW w:w="1700" w:type="dxa"/>
           </w:tcPr>
           <w:p>
-            <w:r>
-              <w:rPr>
-                <w:sz w:val="19"/>
-                <w:szCs w:val="19"/>
-              </w:rPr>
-              <w:t>Попытка доступа без авторизации</w:t>
-            </w:r>
+            <w:proofErr w:type="spellStart"/>
+            <w:r>
+              <w:rPr>
+                <w:sz w:val="19"/>
+                <w:szCs w:val="19"/>
+              </w:rPr>
+              <w:t>Попытка</w:t>
+            </w:r>
+            <w:proofErr w:type="spellEnd"/>
+            <w:r>
+              <w:rPr>
+                <w:sz w:val="19"/>
+                <w:szCs w:val="19"/>
+              </w:rPr>
+              <w:t xml:space="preserve"> </w:t>
+            </w:r>
+            <w:proofErr w:type="spellStart"/>
+            <w:r>
+              <w:rPr>
+                <w:sz w:val="19"/>
+                <w:szCs w:val="19"/>
+              </w:rPr>
+              <w:t>доступа</w:t>
+            </w:r>
+            <w:proofErr w:type="spellEnd"/>
+            <w:r>
+              <w:rPr>
+                <w:sz w:val="19"/>
+                <w:szCs w:val="19"/>
+              </w:rPr>
+              <w:t xml:space="preserve"> </w:t>
+            </w:r>
+            <w:proofErr w:type="spellStart"/>
+            <w:r>
+              <w:rPr>
+                <w:sz w:val="19"/>
+                <w:szCs w:val="19"/>
+              </w:rPr>
+              <w:t>без</w:t>
+            </w:r>
+            <w:proofErr w:type="spellEnd"/>
+            <w:r>
+              <w:rPr>
+                <w:sz w:val="19"/>
+                <w:szCs w:val="19"/>
+              </w:rPr>
+              <w:t xml:space="preserve"> </w:t>
+            </w:r>
+            <w:proofErr w:type="spellStart"/>
+            <w:r>
+              <w:rPr>
+                <w:sz w:val="19"/>
+                <w:szCs w:val="19"/>
+              </w:rPr>
+              <w:t>авторизации</w:t>
+            </w:r>
+            <w:proofErr w:type="spellEnd"/>
           </w:p>
         </w:tc>
         <w:tc>
@@ -5085,6 +7485,7 @@
               </w:rPr>
               <w:t xml:space="preserve">Неавторизованный запрос к защищённому </w:t>
             </w:r>
+            <w:proofErr w:type="spellStart"/>
             <w:r>
               <w:rPr>
                 <w:sz w:val="19"/>
@@ -5092,7 +7493,16 @@
                 <w:lang w:val="ru-RU"/>
               </w:rPr>
               <w:lastRenderedPageBreak/>
-              <w:t xml:space="preserve">эндпоинту </w:t>
+              <w:t>эндпоинту</w:t>
+            </w:r>
+            <w:proofErr w:type="spellEnd"/>
+            <w:r>
+              <w:rPr>
+                <w:sz w:val="19"/>
+                <w:szCs w:val="19"/>
+                <w:lang w:val="ru-RU"/>
+              </w:rPr>
+              <w:t xml:space="preserve"> </w:t>
             </w:r>
             <w:r>
               <w:rPr>
@@ -5260,12 +7670,53 @@
             <w:tcW w:w="1760" w:type="dxa"/>
           </w:tcPr>
           <w:p>
-            <w:r>
-              <w:rPr>
-                <w:sz w:val="19"/>
-                <w:szCs w:val="19"/>
-              </w:rPr>
-              <w:t>Инспектор авторизован, роль Inspector</w:t>
+            <w:proofErr w:type="spellStart"/>
+            <w:r>
+              <w:rPr>
+                <w:sz w:val="19"/>
+                <w:szCs w:val="19"/>
+              </w:rPr>
+              <w:t>Инспектор</w:t>
+            </w:r>
+            <w:proofErr w:type="spellEnd"/>
+            <w:r>
+              <w:rPr>
+                <w:sz w:val="19"/>
+                <w:szCs w:val="19"/>
+              </w:rPr>
+              <w:t xml:space="preserve"> </w:t>
+            </w:r>
+            <w:proofErr w:type="spellStart"/>
+            <w:r>
+              <w:rPr>
+                <w:sz w:val="19"/>
+                <w:szCs w:val="19"/>
+              </w:rPr>
+              <w:t>авторизован</w:t>
+            </w:r>
+            <w:proofErr w:type="spellEnd"/>
+            <w:r>
+              <w:rPr>
+                <w:sz w:val="19"/>
+                <w:szCs w:val="19"/>
+              </w:rPr>
+              <w:t xml:space="preserve">, </w:t>
+            </w:r>
+            <w:proofErr w:type="spellStart"/>
+            <w:r>
+              <w:rPr>
+                <w:sz w:val="19"/>
+                <w:szCs w:val="19"/>
+              </w:rPr>
+              <w:t>роль</w:t>
+            </w:r>
+            <w:proofErr w:type="spellEnd"/>
+            <w:r>
+              <w:rPr>
+                <w:sz w:val="19"/>
+                <w:szCs w:val="19"/>
+              </w:rPr>
+              <w:t xml:space="preserve"> Inspector</w:t>
             </w:r>
           </w:p>
         </w:tc>
@@ -5285,7 +7736,25 @@
                 <w:szCs w:val="19"/>
                 <w:lang w:val="ru-RU"/>
               </w:rPr>
-              <w:t xml:space="preserve">Отправить запрос на эндпоинт управления устройствами </w:t>
+              <w:t xml:space="preserve">Отправить запрос на </w:t>
+            </w:r>
+            <w:proofErr w:type="spellStart"/>
+            <w:r>
+              <w:rPr>
+                <w:sz w:val="19"/>
+                <w:szCs w:val="19"/>
+                <w:lang w:val="ru-RU"/>
+              </w:rPr>
+              <w:t>эндпоинт</w:t>
+            </w:r>
+            <w:proofErr w:type="spellEnd"/>
+            <w:r>
+              <w:rPr>
+                <w:sz w:val="19"/>
+                <w:szCs w:val="19"/>
+                <w:lang w:val="ru-RU"/>
+              </w:rPr>
+              <w:t xml:space="preserve"> управления устройствами </w:t>
             </w:r>
             <w:r>
               <w:rPr>
@@ -5367,13 +7836,63 @@
             <w:tcW w:w="1700" w:type="dxa"/>
           </w:tcPr>
           <w:p>
-            <w:r>
-              <w:rPr>
-                <w:sz w:val="19"/>
-                <w:szCs w:val="19"/>
-              </w:rPr>
-              <w:t>Регистрация неисправности датчика оператором</w:t>
-            </w:r>
+            <w:proofErr w:type="spellStart"/>
+            <w:r>
+              <w:rPr>
+                <w:sz w:val="19"/>
+                <w:szCs w:val="19"/>
+              </w:rPr>
+              <w:t>Регистрация</w:t>
+            </w:r>
+            <w:proofErr w:type="spellEnd"/>
+            <w:r>
+              <w:rPr>
+                <w:sz w:val="19"/>
+                <w:szCs w:val="19"/>
+              </w:rPr>
+              <w:t xml:space="preserve"> </w:t>
+            </w:r>
+            <w:proofErr w:type="spellStart"/>
+            <w:r>
+              <w:rPr>
+                <w:sz w:val="19"/>
+                <w:szCs w:val="19"/>
+              </w:rPr>
+              <w:t>неисправности</w:t>
+            </w:r>
+            <w:proofErr w:type="spellEnd"/>
+            <w:r>
+              <w:rPr>
+                <w:sz w:val="19"/>
+                <w:szCs w:val="19"/>
+              </w:rPr>
+              <w:t xml:space="preserve"> </w:t>
+            </w:r>
+            <w:proofErr w:type="spellStart"/>
+            <w:r>
+              <w:rPr>
+                <w:sz w:val="19"/>
+                <w:szCs w:val="19"/>
+              </w:rPr>
+              <w:t>датчика</w:t>
+            </w:r>
+            <w:proofErr w:type="spellEnd"/>
+            <w:r>
+              <w:rPr>
+                <w:sz w:val="19"/>
+                <w:szCs w:val="19"/>
+              </w:rPr>
+              <w:t xml:space="preserve"> </w:t>
+            </w:r>
+            <w:proofErr w:type="spellStart"/>
+            <w:r>
+              <w:rPr>
+                <w:sz w:val="19"/>
+                <w:szCs w:val="19"/>
+              </w:rPr>
+              <w:t>оператором</w:t>
+            </w:r>
+            <w:proofErr w:type="spellEnd"/>
           </w:p>
         </w:tc>
         <w:tc>
@@ -5434,6 +7953,7 @@
               </w:rPr>
               <w:t xml:space="preserve">Создаётся </w:t>
             </w:r>
+            <w:proofErr w:type="spellStart"/>
             <w:r>
               <w:rPr>
                 <w:sz w:val="19"/>
@@ -5441,6 +7961,7 @@
               </w:rPr>
               <w:t>ServiceTicket</w:t>
             </w:r>
+            <w:proofErr w:type="spellEnd"/>
             <w:r>
               <w:rPr>
                 <w:sz w:val="19"/>
@@ -5472,13 +7993,47 @@
             <w:tcW w:w="1700" w:type="dxa"/>
           </w:tcPr>
           <w:p>
-            <w:r>
-              <w:rPr>
-                <w:sz w:val="19"/>
-                <w:szCs w:val="19"/>
-              </w:rPr>
-              <w:t>Авторизация с неверным паролем</w:t>
-            </w:r>
+            <w:proofErr w:type="spellStart"/>
+            <w:r>
+              <w:rPr>
+                <w:sz w:val="19"/>
+                <w:szCs w:val="19"/>
+              </w:rPr>
+              <w:t>Авторизация</w:t>
+            </w:r>
+            <w:proofErr w:type="spellEnd"/>
+            <w:r>
+              <w:rPr>
+                <w:sz w:val="19"/>
+                <w:szCs w:val="19"/>
+              </w:rPr>
+              <w:t xml:space="preserve"> с </w:t>
+            </w:r>
+            <w:proofErr w:type="spellStart"/>
+            <w:r>
+              <w:rPr>
+                <w:sz w:val="19"/>
+                <w:szCs w:val="19"/>
+              </w:rPr>
+              <w:t>неверным</w:t>
+            </w:r>
+            <w:proofErr w:type="spellEnd"/>
+            <w:r>
+              <w:rPr>
+                <w:sz w:val="19"/>
+                <w:szCs w:val="19"/>
+              </w:rPr>
+              <w:t xml:space="preserve"> </w:t>
+            </w:r>
+            <w:proofErr w:type="spellStart"/>
+            <w:r>
+              <w:rPr>
+                <w:sz w:val="19"/>
+                <w:szCs w:val="19"/>
+              </w:rPr>
+              <w:t>паролем</w:t>
+            </w:r>
+            <w:proofErr w:type="spellEnd"/>
           </w:p>
         </w:tc>
         <w:tc>
@@ -5562,13 +8117,63 @@
             <w:tcW w:w="1700" w:type="dxa"/>
           </w:tcPr>
           <w:p>
-            <w:r>
-              <w:rPr>
-                <w:sz w:val="19"/>
-                <w:szCs w:val="19"/>
-              </w:rPr>
-              <w:t>Просмотр сводной аналитики руководителем</w:t>
-            </w:r>
+            <w:proofErr w:type="spellStart"/>
+            <w:r>
+              <w:rPr>
+                <w:sz w:val="19"/>
+                <w:szCs w:val="19"/>
+              </w:rPr>
+              <w:t>Просмотр</w:t>
+            </w:r>
+            <w:proofErr w:type="spellEnd"/>
+            <w:r>
+              <w:rPr>
+                <w:sz w:val="19"/>
+                <w:szCs w:val="19"/>
+              </w:rPr>
+              <w:t xml:space="preserve"> </w:t>
+            </w:r>
+            <w:proofErr w:type="spellStart"/>
+            <w:r>
+              <w:rPr>
+                <w:sz w:val="19"/>
+                <w:szCs w:val="19"/>
+              </w:rPr>
+              <w:t>сводной</w:t>
+            </w:r>
+            <w:proofErr w:type="spellEnd"/>
+            <w:r>
+              <w:rPr>
+                <w:sz w:val="19"/>
+                <w:szCs w:val="19"/>
+              </w:rPr>
+              <w:t xml:space="preserve"> </w:t>
+            </w:r>
+            <w:proofErr w:type="spellStart"/>
+            <w:r>
+              <w:rPr>
+                <w:sz w:val="19"/>
+                <w:szCs w:val="19"/>
+              </w:rPr>
+              <w:t>аналитики</w:t>
+            </w:r>
+            <w:proofErr w:type="spellEnd"/>
+            <w:r>
+              <w:rPr>
+                <w:sz w:val="19"/>
+                <w:szCs w:val="19"/>
+              </w:rPr>
+              <w:t xml:space="preserve"> </w:t>
+            </w:r>
+            <w:proofErr w:type="spellStart"/>
+            <w:r>
+              <w:rPr>
+                <w:sz w:val="19"/>
+                <w:szCs w:val="19"/>
+              </w:rPr>
+              <w:t>руководителем</w:t>
+            </w:r>
+            <w:proofErr w:type="spellEnd"/>
           </w:p>
         </w:tc>
         <w:tc>
@@ -6463,7 +9068,6 @@
   <w:style w:type="character" w:default="1" w:styleId="DefaultParagraphFont">
     <w:name w:val="Default Paragraph Font"/>
     <w:uiPriority w:val="1"/>
-    <w:semiHidden/>
     <w:unhideWhenUsed/>
   </w:style>
   <w:style w:type="table" w:default="1" w:styleId="TableNormal">

</xml_diff>